<commit_message>
Add Express crash course projects
</commit_message>
<xml_diff>
--- a/SDS_learning_diary_template.docx
+++ b/SDS_learning_diary_template.docx
@@ -375,267 +375,419 @@
         </w:rPr>
         <w:t>Today I studied the Introduction part of the Node.js updated video and followed the NODEJS-CRASH-2024 project. I learned the basic idea of Node.js and how it can run JavaScript outside the browser. I also understood how ES modules work with import and export.</w:t>
       </w:r>
+    </w:p>
+    <w:p>
+      <w:pPr>
+        <w:rPr>
+          <w:rFonts w:hint="eastAsia" w:ascii="Times New Roman" w:hAnsi="Times New Roman" w:eastAsia="Times New Roman" w:cs="Times New Roman"/>
+          <w:sz w:val="24"/>
+          <w:szCs w:val="24"/>
+          <w:lang w:val="en-US" w:eastAsia="en-US" w:bidi="ar-SA"/>
+        </w:rPr>
+      </w:pPr>
+      <w:r>
+        <w:rPr>
+          <w:rFonts w:hint="eastAsia" w:ascii="Times New Roman" w:hAnsi="Times New Roman" w:eastAsia="Times New Roman" w:cs="Times New Roman"/>
+          <w:sz w:val="24"/>
+          <w:szCs w:val="24"/>
+          <w:lang w:val="en-US" w:eastAsia="en-US" w:bidi="ar-SA"/>
+        </w:rPr>
+        <w:t>I practiced several built-in Node.js modules. In pathDemo.js, I learned how to use path.basename, path.dirname, path.extname, path.join, and path.resolve to work with file paths. In urlDemo.js, I learned how to create a URL object, read query parameters, and convert file URLs.</w:t>
+      </w:r>
+    </w:p>
+    <w:p>
+      <w:pPr>
+        <w:rPr>
+          <w:rFonts w:hint="eastAsia" w:ascii="Times New Roman" w:hAnsi="Times New Roman" w:eastAsia="Times New Roman" w:cs="Times New Roman"/>
+          <w:sz w:val="24"/>
+          <w:szCs w:val="24"/>
+          <w:lang w:val="en-US" w:eastAsia="en-US" w:bidi="ar-SA"/>
+        </w:rPr>
+      </w:pPr>
+      <w:r>
+        <w:rPr>
+          <w:rFonts w:hint="eastAsia" w:ascii="Times New Roman" w:hAnsi="Times New Roman" w:eastAsia="Times New Roman" w:cs="Times New Roman"/>
+          <w:sz w:val="24"/>
+          <w:szCs w:val="24"/>
+          <w:lang w:val="en-US" w:eastAsia="en-US" w:bidi="ar-SA"/>
+        </w:rPr>
+        <w:t>I also practiced file handling in fsDemo.js. I used fs/promises with async and await to read, write, and append files. This helped me understand asynchronous programming better. In eventsDemo.js, I learned how EventEmitter works by creating custom events like greet and goodbye.</w:t>
+      </w:r>
+    </w:p>
+    <w:p>
+      <w:pPr>
+        <w:rPr>
+          <w:rFonts w:hint="eastAsia" w:ascii="Times New Roman" w:hAnsi="Times New Roman" w:eastAsia="Times New Roman" w:cs="Times New Roman"/>
+          <w:sz w:val="24"/>
+          <w:szCs w:val="24"/>
+          <w:lang w:val="en-US" w:eastAsia="en-US" w:bidi="ar-SA"/>
+        </w:rPr>
+      </w:pPr>
+      <w:r>
+        <w:rPr>
+          <w:rFonts w:hint="eastAsia" w:ascii="Times New Roman" w:hAnsi="Times New Roman" w:eastAsia="Times New Roman" w:cs="Times New Roman"/>
+          <w:sz w:val="24"/>
+          <w:szCs w:val="24"/>
+          <w:lang w:val="en-US" w:eastAsia="en-US" w:bidi="ar-SA"/>
+        </w:rPr>
+        <w:t>The most useful part was creating an HTTP server without Express. In server.js, I learned how to serve HTML pages using the http, fs, url, and path modules. In server2.js, I learned how to create simple API routes such as GET /api/users, GET /api/users/:id, and POST /api/users. I also learned how request data is received in chunks.</w:t>
+      </w:r>
+    </w:p>
+    <w:p>
+      <w:pPr>
+        <w:rPr>
+          <w:rFonts w:hint="eastAsia" w:ascii="Times New Roman" w:hAnsi="Times New Roman" w:eastAsia="Times New Roman" w:cs="Times New Roman"/>
+          <w:sz w:val="24"/>
+          <w:szCs w:val="24"/>
+          <w:lang w:val="en-US" w:eastAsia="en-US" w:bidi="ar-SA"/>
+        </w:rPr>
+      </w:pPr>
+      <w:r>
+        <w:rPr>
+          <w:rFonts w:hint="eastAsia" w:ascii="Times New Roman" w:hAnsi="Times New Roman" w:eastAsia="Times New Roman" w:cs="Times New Roman"/>
+          <w:sz w:val="24"/>
+          <w:szCs w:val="24"/>
+          <w:lang w:val="en-US" w:eastAsia="en-US" w:bidi="ar-SA"/>
+        </w:rPr>
+        <w:t>Overall, this module helped me understand the fundamentals of Node.js more clearly. I now know how to use core modules and how a basic server works before using frameworks like Express.</w:t>
+      </w:r>
+    </w:p>
+    <w:p>
+      <w:pPr>
+        <w:rPr>
+          <w:rFonts w:hint="eastAsia" w:ascii="Times New Roman" w:hAnsi="Times New Roman" w:eastAsia="Times New Roman" w:cs="Times New Roman"/>
+          <w:sz w:val="24"/>
+          <w:szCs w:val="24"/>
+          <w:lang w:val="en-US" w:eastAsia="en-US" w:bidi="ar-SA"/>
+        </w:rPr>
+      </w:pPr>
+    </w:p>
+    <w:p>
+      <w:pPr>
+        <w:rPr>
+          <w:rFonts w:hint="eastAsia" w:ascii="Times New Roman" w:hAnsi="Times New Roman" w:eastAsia="Times New Roman" w:cs="Times New Roman"/>
+          <w:sz w:val="24"/>
+          <w:szCs w:val="24"/>
+          <w:lang w:val="en-US" w:eastAsia="en-US" w:bidi="ar-SA"/>
+        </w:rPr>
+      </w:pPr>
+    </w:p>
+    <w:p>
+      <w:pPr>
+        <w:rPr>
+          <w:rFonts w:hint="eastAsia" w:ascii="Times New Roman" w:hAnsi="Times New Roman" w:eastAsia="Times New Roman" w:cs="Times New Roman"/>
+          <w:sz w:val="24"/>
+          <w:szCs w:val="24"/>
+          <w:lang w:val="en-US" w:eastAsia="en-US" w:bidi="ar-SA"/>
+        </w:rPr>
+      </w:pPr>
+      <w:r>
+        <w:rPr>
+          <w:rFonts w:hint="eastAsia" w:ascii="Times New Roman" w:hAnsi="Times New Roman" w:eastAsia="Times New Roman" w:cs="Times New Roman"/>
+          <w:sz w:val="24"/>
+          <w:szCs w:val="24"/>
+          <w:lang w:val="en-US" w:eastAsia="en-US" w:bidi="ar-SA"/>
+        </w:rPr>
+        <w:t>2.5.2026</w:t>
+      </w:r>
+    </w:p>
+    <w:p>
+      <w:pPr>
+        <w:rPr>
+          <w:rFonts w:hint="eastAsia" w:ascii="Times New Roman" w:hAnsi="Times New Roman" w:eastAsia="Times New Roman" w:cs="Times New Roman"/>
+          <w:sz w:val="24"/>
+          <w:szCs w:val="24"/>
+          <w:lang w:val="en-US" w:eastAsia="en-US" w:bidi="ar-SA"/>
+        </w:rPr>
+      </w:pPr>
+    </w:p>
+    <w:p>
+      <w:pPr>
+        <w:rPr>
+          <w:rFonts w:hint="eastAsia" w:ascii="Times New Roman" w:hAnsi="Times New Roman" w:eastAsia="Times New Roman" w:cs="Times New Roman"/>
+          <w:sz w:val="24"/>
+          <w:szCs w:val="24"/>
+          <w:lang w:val="en-US" w:eastAsia="en-US" w:bidi="ar-SA"/>
+        </w:rPr>
+      </w:pPr>
+      <w:r>
+        <w:rPr>
+          <w:rFonts w:hint="eastAsia" w:ascii="Times New Roman" w:hAnsi="Times New Roman" w:eastAsia="Times New Roman" w:cs="Times New Roman"/>
+          <w:sz w:val="24"/>
+          <w:szCs w:val="24"/>
+          <w:lang w:val="en-US" w:eastAsia="en-US" w:bidi="ar-SA"/>
+        </w:rPr>
+        <w:t>MongoDB</w:t>
+      </w:r>
+    </w:p>
+    <w:p>
+      <w:pPr>
+        <w:rPr>
+          <w:rFonts w:hint="eastAsia" w:ascii="Times New Roman" w:hAnsi="Times New Roman" w:eastAsia="Times New Roman" w:cs="Times New Roman"/>
+          <w:sz w:val="24"/>
+          <w:szCs w:val="24"/>
+          <w:lang w:val="en-US" w:eastAsia="en-US" w:bidi="ar-SA"/>
+        </w:rPr>
+      </w:pPr>
+    </w:p>
+    <w:p>
+      <w:pPr>
+        <w:rPr>
+          <w:rFonts w:hint="eastAsia" w:ascii="Times New Roman" w:hAnsi="Times New Roman" w:eastAsia="Times New Roman" w:cs="Times New Roman"/>
+          <w:sz w:val="24"/>
+          <w:szCs w:val="24"/>
+          <w:lang w:val="en-US" w:eastAsia="en-US" w:bidi="ar-SA"/>
+        </w:rPr>
+      </w:pPr>
+      <w:r>
+        <w:rPr>
+          <w:rFonts w:hint="eastAsia" w:ascii="Times New Roman" w:hAnsi="Times New Roman" w:eastAsia="Times New Roman" w:cs="Times New Roman"/>
+          <w:sz w:val="24"/>
+          <w:szCs w:val="24"/>
+          <w:lang w:val="en-US" w:eastAsia="en-US" w:bidi="ar-SA"/>
+        </w:rPr>
+        <w:t>Today I studied the MongoDB Crash Course video. I learned the basic idea of MongoDB and how it is different from relational databases. MongoDB stores data as documents inside collections, and the document structure is similar to JSON.</w:t>
+      </w:r>
+    </w:p>
+    <w:p>
+      <w:pPr>
+        <w:rPr>
+          <w:rFonts w:hint="eastAsia" w:ascii="Times New Roman" w:hAnsi="Times New Roman" w:eastAsia="Times New Roman" w:cs="Times New Roman"/>
+          <w:sz w:val="24"/>
+          <w:szCs w:val="24"/>
+          <w:lang w:val="en-US" w:eastAsia="en-US" w:bidi="ar-SA"/>
+        </w:rPr>
+      </w:pPr>
+      <w:r>
+        <w:rPr>
+          <w:rFonts w:hint="eastAsia" w:ascii="Times New Roman" w:hAnsi="Times New Roman" w:eastAsia="Times New Roman" w:cs="Times New Roman"/>
+          <w:sz w:val="24"/>
+          <w:szCs w:val="24"/>
+          <w:lang w:val="en-US" w:eastAsia="en-US" w:bidi="ar-SA"/>
+        </w:rPr>
+        <w:t>I learned how to create a database and collection, and how to insert data using commands such as insertOne() and insertMany(). I also practiced reading data with find() and findOne(), including using filters to search for specific documents.</w:t>
+      </w:r>
+    </w:p>
+    <w:p>
+      <w:pPr>
+        <w:rPr>
+          <w:rFonts w:hint="eastAsia" w:ascii="Times New Roman" w:hAnsi="Times New Roman" w:eastAsia="Times New Roman" w:cs="Times New Roman"/>
+          <w:sz w:val="24"/>
+          <w:szCs w:val="24"/>
+          <w:lang w:val="en-US" w:eastAsia="en-US" w:bidi="ar-SA"/>
+        </w:rPr>
+      </w:pPr>
+      <w:r>
+        <w:rPr>
+          <w:rFonts w:hint="eastAsia" w:ascii="Times New Roman" w:hAnsi="Times New Roman" w:eastAsia="Times New Roman" w:cs="Times New Roman"/>
+          <w:sz w:val="24"/>
+          <w:szCs w:val="24"/>
+          <w:lang w:val="en-US" w:eastAsia="en-US" w:bidi="ar-SA"/>
+        </w:rPr>
+        <w:t>After that, I learned how to update documents. I practiced using updateOne() and updateMany() with operators such as $set to change fields. I also learned how to delete data using deleteOne() and deleteMany().</w:t>
+      </w:r>
+    </w:p>
+    <w:p>
+      <w:pPr>
+        <w:rPr>
+          <w:rFonts w:hint="eastAsia" w:ascii="Times New Roman" w:hAnsi="Times New Roman" w:eastAsia="Times New Roman" w:cs="Times New Roman"/>
+          <w:sz w:val="24"/>
+          <w:szCs w:val="24"/>
+          <w:lang w:val="en-US" w:eastAsia="en-US" w:bidi="ar-SA"/>
+        </w:rPr>
+      </w:pPr>
+      <w:r>
+        <w:rPr>
+          <w:rFonts w:hint="eastAsia" w:ascii="Times New Roman" w:hAnsi="Times New Roman" w:eastAsia="Times New Roman" w:cs="Times New Roman"/>
+          <w:sz w:val="24"/>
+          <w:szCs w:val="24"/>
+          <w:lang w:val="en-US" w:eastAsia="en-US" w:bidi="ar-SA"/>
+        </w:rPr>
+        <w:t>The most important part for me was understanding the CRUD operations: create, read, update, and delete. These operations are the foundation of working with data in MongoDB. I also learned that each document has an _id, which is used to uniquely identify it.</w:t>
+      </w:r>
+    </w:p>
+    <w:p>
+      <w:pPr>
+        <w:rPr>
+          <w:rFonts w:hint="eastAsia" w:ascii="Times New Roman" w:hAnsi="Times New Roman" w:eastAsia="Times New Roman" w:cs="Times New Roman"/>
+          <w:sz w:val="24"/>
+          <w:szCs w:val="24"/>
+          <w:lang w:val="en-US" w:eastAsia="en-US" w:bidi="ar-SA"/>
+        </w:rPr>
+      </w:pPr>
+      <w:r>
+        <w:rPr>
+          <w:rFonts w:hint="eastAsia" w:ascii="Times New Roman" w:hAnsi="Times New Roman" w:eastAsia="Times New Roman" w:cs="Times New Roman"/>
+          <w:sz w:val="24"/>
+          <w:szCs w:val="24"/>
+          <w:lang w:val="en-US" w:eastAsia="en-US" w:bidi="ar-SA"/>
+        </w:rPr>
+        <w:t>Overall, this module helped me understand MongoDB fundamentals. I now know the basic syntax for managing documents and data, and I feel more comfortable using MongoDB for simple database operations.</w:t>
+      </w:r>
+    </w:p>
+    <w:p>
+      <w:pPr>
+        <w:rPr>
+          <w:rFonts w:hint="eastAsia" w:ascii="Times New Roman" w:hAnsi="Times New Roman" w:eastAsia="Times New Roman" w:cs="Times New Roman"/>
+          <w:sz w:val="24"/>
+          <w:szCs w:val="24"/>
+          <w:lang w:val="en-US" w:eastAsia="en-US" w:bidi="ar-SA"/>
+        </w:rPr>
+      </w:pPr>
+    </w:p>
+    <w:p>
+      <w:pPr>
+        <w:rPr>
+          <w:rFonts w:hint="eastAsia" w:ascii="Times New Roman" w:hAnsi="Times New Roman" w:eastAsia="Times New Roman" w:cs="Times New Roman"/>
+          <w:sz w:val="24"/>
+          <w:szCs w:val="24"/>
+          <w:lang w:val="en-US" w:eastAsia="en-US" w:bidi="ar-SA"/>
+        </w:rPr>
+      </w:pPr>
+      <w:r>
+        <w:rPr>
+          <w:rFonts w:hint="eastAsia" w:ascii="Times New Roman" w:hAnsi="Times New Roman" w:eastAsia="Times New Roman" w:cs="Times New Roman"/>
+          <w:sz w:val="24"/>
+          <w:szCs w:val="24"/>
+          <w:lang w:val="en-US" w:eastAsia="en-US" w:bidi="ar-SA"/>
+        </w:rPr>
+        <w:t>Express JS</w:t>
+      </w:r>
+    </w:p>
+    <w:p>
+      <w:pPr>
+        <w:rPr>
+          <w:rFonts w:hint="eastAsia" w:ascii="Times New Roman" w:hAnsi="Times New Roman" w:eastAsia="Times New Roman" w:cs="Times New Roman"/>
+          <w:sz w:val="24"/>
+          <w:szCs w:val="24"/>
+          <w:lang w:val="en-US" w:eastAsia="en-US" w:bidi="ar-SA"/>
+        </w:rPr>
+      </w:pPr>
+    </w:p>
+    <w:p>
+      <w:pPr>
+        <w:rPr>
+          <w:rFonts w:hint="eastAsia" w:ascii="Times New Roman" w:hAnsi="Times New Roman" w:eastAsia="Times New Roman" w:cs="Times New Roman"/>
+          <w:sz w:val="24"/>
+          <w:szCs w:val="24"/>
+          <w:lang w:val="en-US" w:eastAsia="en-US" w:bidi="ar-SA"/>
+        </w:rPr>
+      </w:pPr>
+      <w:r>
+        <w:rPr>
+          <w:rFonts w:hint="eastAsia" w:ascii="Times New Roman" w:hAnsi="Times New Roman" w:eastAsia="Times New Roman" w:cs="Times New Roman"/>
+          <w:sz w:val="24"/>
+          <w:szCs w:val="24"/>
+          <w:lang w:val="en-US" w:eastAsia="en-US" w:bidi="ar-SA"/>
+        </w:rPr>
+        <w:t>Today I studied the Express JS Crash Course and followed the `EXPRESS-CRASH` and `EXPRESS2` projects. I learned that Express.js is a framework for Node.js that makes it easier to create web servers, routes, APIs, and middleware.</w:t>
+      </w:r>
+    </w:p>
+    <w:p>
+      <w:pPr>
+        <w:rPr>
+          <w:rFonts w:hint="eastAsia" w:ascii="Times New Roman" w:hAnsi="Times New Roman" w:eastAsia="Times New Roman" w:cs="Times New Roman"/>
+          <w:sz w:val="24"/>
+          <w:szCs w:val="24"/>
+          <w:lang w:val="en-US" w:eastAsia="en-US" w:bidi="ar-SA"/>
+        </w:rPr>
+      </w:pPr>
+      <w:r>
+        <w:rPr>
+          <w:rFonts w:hint="eastAsia" w:ascii="Times New Roman" w:hAnsi="Times New Roman" w:eastAsia="Times New Roman" w:cs="Times New Roman"/>
+          <w:sz w:val="24"/>
+          <w:szCs w:val="24"/>
+          <w:lang w:val="en-US" w:eastAsia="en-US" w:bidi="ar-SA"/>
+        </w:rPr>
+        <w:t>In the `EXPRESS-CRASH` project, I learned how to create an Express server with `express()`, set up middleware with `app.use()`, and serve static files from the `public` folder. I also learned how to use `express.json()` and `express.urlencoded()` to read request body data.</w:t>
+      </w:r>
+    </w:p>
+    <w:p>
+      <w:pPr>
+        <w:rPr>
+          <w:rFonts w:hint="eastAsia" w:ascii="Times New Roman" w:hAnsi="Times New Roman" w:eastAsia="Times New Roman" w:cs="Times New Roman"/>
+          <w:sz w:val="24"/>
+          <w:szCs w:val="24"/>
+          <w:lang w:val="en-US" w:eastAsia="en-US" w:bidi="ar-SA"/>
+        </w:rPr>
+      </w:pPr>
+      <w:r>
+        <w:rPr>
+          <w:rFonts w:hint="eastAsia" w:ascii="Times New Roman" w:hAnsi="Times New Roman" w:eastAsia="Times New Roman" w:cs="Times New Roman"/>
+          <w:sz w:val="24"/>
+          <w:szCs w:val="24"/>
+          <w:lang w:val="en-US" w:eastAsia="en-US" w:bidi="ar-SA"/>
+        </w:rPr>
+        <w:t>I practiced routing by creatin</w:t>
+      </w:r>
       <w:bookmarkStart w:id="0" w:name="_GoBack"/>
       <w:bookmarkEnd w:id="0"/>
-    </w:p>
-    <w:p>
-      <w:pPr>
-        <w:rPr>
-          <w:rFonts w:hint="eastAsia" w:ascii="Times New Roman" w:hAnsi="Times New Roman" w:eastAsia="Times New Roman" w:cs="Times New Roman"/>
-          <w:sz w:val="24"/>
-          <w:szCs w:val="24"/>
-          <w:lang w:val="en-US" w:eastAsia="en-US" w:bidi="ar-SA"/>
-        </w:rPr>
-      </w:pPr>
-      <w:r>
-        <w:rPr>
-          <w:rFonts w:hint="eastAsia" w:ascii="Times New Roman" w:hAnsi="Times New Roman" w:eastAsia="Times New Roman" w:cs="Times New Roman"/>
-          <w:sz w:val="24"/>
-          <w:szCs w:val="24"/>
-          <w:lang w:val="en-US" w:eastAsia="en-US" w:bidi="ar-SA"/>
-        </w:rPr>
-        <w:t>I practiced several built-in Node.js modules. In pathDemo.js, I learned how to use path.basename, path.dirname, path.extname, path.join, and path.resolve to work with file paths. In urlDemo.js, I learned how to create a URL object, read query parameters, and convert file URLs.</w:t>
-      </w:r>
-    </w:p>
-    <w:p>
-      <w:pPr>
-        <w:rPr>
-          <w:rFonts w:hint="eastAsia" w:ascii="Times New Roman" w:hAnsi="Times New Roman" w:eastAsia="Times New Roman" w:cs="Times New Roman"/>
-          <w:sz w:val="24"/>
-          <w:szCs w:val="24"/>
-          <w:lang w:val="en-US" w:eastAsia="en-US" w:bidi="ar-SA"/>
-        </w:rPr>
-      </w:pPr>
-      <w:r>
-        <w:rPr>
-          <w:rFonts w:hint="eastAsia" w:ascii="Times New Roman" w:hAnsi="Times New Roman" w:eastAsia="Times New Roman" w:cs="Times New Roman"/>
-          <w:sz w:val="24"/>
-          <w:szCs w:val="24"/>
-          <w:lang w:val="en-US" w:eastAsia="en-US" w:bidi="ar-SA"/>
-        </w:rPr>
-        <w:t>I also practiced file handling in fsDemo.js. I used fs/promises with async and await to read, write, and append files. This helped me understand asynchronous programming better. In eventsDemo.js, I learned how EventEmitter works by creating custom events like greet and goodbye.</w:t>
-      </w:r>
-    </w:p>
-    <w:p>
-      <w:pPr>
-        <w:rPr>
-          <w:rFonts w:hint="eastAsia" w:ascii="Times New Roman" w:hAnsi="Times New Roman" w:eastAsia="Times New Roman" w:cs="Times New Roman"/>
-          <w:sz w:val="24"/>
-          <w:szCs w:val="24"/>
-          <w:lang w:val="en-US" w:eastAsia="en-US" w:bidi="ar-SA"/>
-        </w:rPr>
-      </w:pPr>
-      <w:r>
-        <w:rPr>
-          <w:rFonts w:hint="eastAsia" w:ascii="Times New Roman" w:hAnsi="Times New Roman" w:eastAsia="Times New Roman" w:cs="Times New Roman"/>
-          <w:sz w:val="24"/>
-          <w:szCs w:val="24"/>
-          <w:lang w:val="en-US" w:eastAsia="en-US" w:bidi="ar-SA"/>
-        </w:rPr>
-        <w:t>The most useful part was creating an HTTP server without Express. In server.js, I learned how to serve HTML pages using the http, fs, url, and path modules. In server2.js, I learned how to create simple API routes such as GET /api/users, GET /api/users/:id, and POST /api/users. I also learned how request data is received in chunks.</w:t>
-      </w:r>
-    </w:p>
-    <w:p>
-      <w:pPr>
-        <w:rPr>
-          <w:rFonts w:hint="eastAsia" w:ascii="Times New Roman" w:hAnsi="Times New Roman" w:eastAsia="Times New Roman" w:cs="Times New Roman"/>
-          <w:sz w:val="24"/>
-          <w:szCs w:val="24"/>
-          <w:lang w:val="en-US" w:eastAsia="en-US" w:bidi="ar-SA"/>
-        </w:rPr>
-      </w:pPr>
-      <w:r>
-        <w:rPr>
-          <w:rFonts w:hint="eastAsia" w:ascii="Times New Roman" w:hAnsi="Times New Roman" w:eastAsia="Times New Roman" w:cs="Times New Roman"/>
-          <w:sz w:val="24"/>
-          <w:szCs w:val="24"/>
-          <w:lang w:val="en-US" w:eastAsia="en-US" w:bidi="ar-SA"/>
-        </w:rPr>
-        <w:t>Overall, this module helped me understand the fundamentals of Node.js more clearly. I now know how to use core modules and how a basic server works before using frameworks like Express.</w:t>
-      </w:r>
-    </w:p>
-    <w:p>
-      <w:pPr>
-        <w:rPr>
-          <w:rFonts w:hint="eastAsia" w:ascii="Times New Roman" w:hAnsi="Times New Roman" w:eastAsia="Times New Roman" w:cs="Times New Roman"/>
-          <w:sz w:val="24"/>
-          <w:szCs w:val="24"/>
-          <w:lang w:val="en-US" w:eastAsia="en-US" w:bidi="ar-SA"/>
-        </w:rPr>
-      </w:pPr>
-    </w:p>
-    <w:p>
-      <w:pPr>
-        <w:rPr>
-          <w:rFonts w:hint="eastAsia" w:ascii="Times New Roman" w:hAnsi="Times New Roman" w:eastAsia="Times New Roman" w:cs="Times New Roman"/>
-          <w:sz w:val="24"/>
-          <w:szCs w:val="24"/>
-          <w:lang w:val="en-US" w:eastAsia="en-US" w:bidi="ar-SA"/>
-        </w:rPr>
-      </w:pPr>
-    </w:p>
-    <w:p>
-      <w:pPr>
-        <w:rPr>
-          <w:rFonts w:hint="eastAsia" w:ascii="Times New Roman" w:hAnsi="Times New Roman" w:eastAsia="Times New Roman" w:cs="Times New Roman"/>
-          <w:sz w:val="24"/>
-          <w:szCs w:val="24"/>
-          <w:lang w:val="en-US" w:eastAsia="en-US" w:bidi="ar-SA"/>
-        </w:rPr>
-      </w:pPr>
-      <w:r>
-        <w:rPr>
-          <w:rFonts w:hint="eastAsia" w:ascii="Times New Roman" w:hAnsi="Times New Roman" w:eastAsia="Times New Roman" w:cs="Times New Roman"/>
-          <w:sz w:val="24"/>
-          <w:szCs w:val="24"/>
-          <w:lang w:val="en-US" w:eastAsia="en-US" w:bidi="ar-SA"/>
-        </w:rPr>
-        <w:t>2.5.2026</w:t>
-      </w:r>
-    </w:p>
-    <w:p>
-      <w:pPr>
-        <w:rPr>
-          <w:rFonts w:hint="eastAsia" w:ascii="Times New Roman" w:hAnsi="Times New Roman" w:eastAsia="Times New Roman" w:cs="Times New Roman"/>
-          <w:sz w:val="24"/>
-          <w:szCs w:val="24"/>
-          <w:lang w:val="en-US" w:eastAsia="en-US" w:bidi="ar-SA"/>
-        </w:rPr>
-      </w:pPr>
-    </w:p>
-    <w:p>
-      <w:pPr>
-        <w:rPr>
-          <w:rFonts w:hint="eastAsia" w:ascii="Times New Roman" w:hAnsi="Times New Roman" w:eastAsia="Times New Roman" w:cs="Times New Roman"/>
-          <w:sz w:val="24"/>
-          <w:szCs w:val="24"/>
-          <w:lang w:val="en-US" w:eastAsia="en-US" w:bidi="ar-SA"/>
-        </w:rPr>
-      </w:pPr>
-      <w:r>
-        <w:rPr>
-          <w:rFonts w:hint="eastAsia" w:ascii="Times New Roman" w:hAnsi="Times New Roman" w:eastAsia="Times New Roman" w:cs="Times New Roman"/>
-          <w:sz w:val="24"/>
-          <w:szCs w:val="24"/>
-          <w:lang w:val="en-US" w:eastAsia="en-US" w:bidi="ar-SA"/>
-        </w:rPr>
-        <w:t>MongoDB</w:t>
-      </w:r>
-    </w:p>
-    <w:p>
-      <w:pPr>
-        <w:rPr>
-          <w:rFonts w:hint="eastAsia" w:ascii="Times New Roman" w:hAnsi="Times New Roman" w:eastAsia="Times New Roman" w:cs="Times New Roman"/>
-          <w:sz w:val="24"/>
-          <w:szCs w:val="24"/>
-          <w:lang w:val="en-US" w:eastAsia="en-US" w:bidi="ar-SA"/>
-        </w:rPr>
-      </w:pPr>
-    </w:p>
-    <w:p>
-      <w:pPr>
-        <w:rPr>
-          <w:rFonts w:hint="eastAsia" w:ascii="Times New Roman" w:hAnsi="Times New Roman" w:eastAsia="Times New Roman" w:cs="Times New Roman"/>
-          <w:sz w:val="24"/>
-          <w:szCs w:val="24"/>
-          <w:lang w:val="en-US" w:eastAsia="en-US" w:bidi="ar-SA"/>
-        </w:rPr>
-      </w:pPr>
-      <w:r>
-        <w:rPr>
-          <w:rFonts w:hint="eastAsia" w:ascii="Times New Roman" w:hAnsi="Times New Roman" w:eastAsia="Times New Roman" w:cs="Times New Roman"/>
-          <w:sz w:val="24"/>
-          <w:szCs w:val="24"/>
-          <w:lang w:val="en-US" w:eastAsia="en-US" w:bidi="ar-SA"/>
-        </w:rPr>
-        <w:t>Today I studied the MongoDB Crash Course video. I learned the basic idea of MongoDB and how it is different from relational databases. MongoDB stores data as documents inside collections, and the document structure is similar to JSON.</w:t>
-      </w:r>
-    </w:p>
-    <w:p>
-      <w:pPr>
-        <w:rPr>
-          <w:rFonts w:hint="eastAsia" w:ascii="Times New Roman" w:hAnsi="Times New Roman" w:eastAsia="Times New Roman" w:cs="Times New Roman"/>
-          <w:sz w:val="24"/>
-          <w:szCs w:val="24"/>
-          <w:lang w:val="en-US" w:eastAsia="en-US" w:bidi="ar-SA"/>
-        </w:rPr>
-      </w:pPr>
-      <w:r>
-        <w:rPr>
-          <w:rFonts w:hint="eastAsia" w:ascii="Times New Roman" w:hAnsi="Times New Roman" w:eastAsia="Times New Roman" w:cs="Times New Roman"/>
-          <w:sz w:val="24"/>
-          <w:szCs w:val="24"/>
-          <w:lang w:val="en-US" w:eastAsia="en-US" w:bidi="ar-SA"/>
-        </w:rPr>
-        <w:t>I learned how to create a database and collection, and how to insert data using commands such as insertOne() and insertMany(). I also practiced reading data with find() and findOne(), including using filters to search for specific documents.</w:t>
-      </w:r>
-    </w:p>
-    <w:p>
-      <w:pPr>
-        <w:rPr>
-          <w:rFonts w:hint="eastAsia" w:ascii="Times New Roman" w:hAnsi="Times New Roman" w:eastAsia="Times New Roman" w:cs="Times New Roman"/>
-          <w:sz w:val="24"/>
-          <w:szCs w:val="24"/>
-          <w:lang w:val="en-US" w:eastAsia="en-US" w:bidi="ar-SA"/>
-        </w:rPr>
-      </w:pPr>
-      <w:r>
-        <w:rPr>
-          <w:rFonts w:hint="eastAsia" w:ascii="Times New Roman" w:hAnsi="Times New Roman" w:eastAsia="Times New Roman" w:cs="Times New Roman"/>
-          <w:sz w:val="24"/>
-          <w:szCs w:val="24"/>
-          <w:lang w:val="en-US" w:eastAsia="en-US" w:bidi="ar-SA"/>
-        </w:rPr>
-        <w:t>After that, I learned how to update documents. I practiced using updateOne() and updateMany() with operators such as $set to change fields. I also learned how to delete data using deleteOne() and deleteMany().</w:t>
-      </w:r>
-    </w:p>
-    <w:p>
-      <w:pPr>
-        <w:rPr>
-          <w:rFonts w:hint="eastAsia" w:ascii="Times New Roman" w:hAnsi="Times New Roman" w:eastAsia="Times New Roman" w:cs="Times New Roman"/>
-          <w:sz w:val="24"/>
-          <w:szCs w:val="24"/>
-          <w:lang w:val="en-US" w:eastAsia="en-US" w:bidi="ar-SA"/>
-        </w:rPr>
-      </w:pPr>
-      <w:r>
-        <w:rPr>
-          <w:rFonts w:hint="eastAsia" w:ascii="Times New Roman" w:hAnsi="Times New Roman" w:eastAsia="Times New Roman" w:cs="Times New Roman"/>
-          <w:sz w:val="24"/>
-          <w:szCs w:val="24"/>
-          <w:lang w:val="en-US" w:eastAsia="en-US" w:bidi="ar-SA"/>
-        </w:rPr>
-        <w:t>The most important part for me was understanding the CRUD operations: create, read, update, and delete. These operations are the foundation of working with data in MongoDB. I also learned that each document has an _id, which is used to uniquely identify it.</w:t>
-      </w:r>
-    </w:p>
-    <w:p>
-      <w:pPr>
-        <w:rPr>
-          <w:rFonts w:hint="eastAsia" w:ascii="Times New Roman" w:hAnsi="Times New Roman" w:eastAsia="Times New Roman" w:cs="Times New Roman"/>
-          <w:sz w:val="24"/>
-          <w:szCs w:val="24"/>
-          <w:lang w:val="en-US" w:eastAsia="en-US" w:bidi="ar-SA"/>
-        </w:rPr>
-      </w:pPr>
-      <w:r>
-        <w:rPr>
-          <w:rFonts w:hint="eastAsia" w:ascii="Times New Roman" w:hAnsi="Times New Roman" w:eastAsia="Times New Roman" w:cs="Times New Roman"/>
-          <w:sz w:val="24"/>
-          <w:szCs w:val="24"/>
-          <w:lang w:val="en-US" w:eastAsia="en-US" w:bidi="ar-SA"/>
-        </w:rPr>
-        <w:t>Overall, this module helped me understand MongoDB fundamentals. I now know the basic syntax for managing documents and data, and I feel more comfortable using MongoDB for simple database operations.</w:t>
-      </w:r>
-    </w:p>
-    <w:p>
-      <w:pPr>
-        <w:rPr>
-          <w:rFonts w:hint="eastAsia" w:ascii="Times New Roman" w:hAnsi="Times New Roman" w:eastAsia="Times New Roman" w:cs="Times New Roman"/>
-          <w:sz w:val="24"/>
-          <w:szCs w:val="24"/>
-          <w:lang w:val="en-US" w:eastAsia="en-US" w:bidi="ar-SA"/>
-        </w:rPr>
-      </w:pPr>
+      <w:r>
+        <w:rPr>
+          <w:rFonts w:hint="eastAsia" w:ascii="Times New Roman" w:hAnsi="Times New Roman" w:eastAsia="Times New Roman" w:cs="Times New Roman"/>
+          <w:sz w:val="24"/>
+          <w:szCs w:val="24"/>
+          <w:lang w:val="en-US" w:eastAsia="en-US" w:bidi="ar-SA"/>
+        </w:rPr>
+        <w:t>g `/api/posts` routes. I learned how to use `GET`, `POST`, `PUT`, and `DELETE` requests to read, create, update, and delete post data. I also learned how route parameters like `/:id` and query parameters like `?limit=2` work.</w:t>
+      </w:r>
+    </w:p>
+    <w:p>
+      <w:pPr>
+        <w:rPr>
+          <w:rFonts w:hint="eastAsia" w:ascii="Times New Roman" w:hAnsi="Times New Roman" w:eastAsia="Times New Roman" w:cs="Times New Roman"/>
+          <w:sz w:val="24"/>
+          <w:szCs w:val="24"/>
+          <w:lang w:val="en-US" w:eastAsia="en-US" w:bidi="ar-SA"/>
+        </w:rPr>
+      </w:pPr>
+      <w:r>
+        <w:rPr>
+          <w:rFonts w:hint="eastAsia" w:ascii="Times New Roman" w:hAnsi="Times New Roman" w:eastAsia="Times New Roman" w:cs="Times New Roman"/>
+          <w:sz w:val="24"/>
+          <w:szCs w:val="24"/>
+          <w:lang w:val="en-US" w:eastAsia="en-US" w:bidi="ar-SA"/>
+        </w:rPr>
+        <w:t>I also learned how to organize Express code better by separating routes, controllers, and middleware. The controller file handled the main logic, while middleware files handled logging, 404 errors, and general error responses.</w:t>
+      </w:r>
+    </w:p>
+    <w:p>
+      <w:pPr>
+        <w:rPr>
+          <w:rFonts w:hint="eastAsia" w:ascii="Times New Roman" w:hAnsi="Times New Roman" w:eastAsia="Times New Roman" w:cs="Times New Roman"/>
+          <w:sz w:val="24"/>
+          <w:szCs w:val="24"/>
+          <w:lang w:val="en-US" w:eastAsia="en-US" w:bidi="ar-SA"/>
+        </w:rPr>
+      </w:pPr>
+      <w:r>
+        <w:rPr>
+          <w:rFonts w:hint="eastAsia" w:ascii="Times New Roman" w:hAnsi="Times New Roman" w:eastAsia="Times New Roman" w:cs="Times New Roman"/>
+          <w:sz w:val="24"/>
+          <w:szCs w:val="24"/>
+          <w:lang w:val="en-US" w:eastAsia="en-US" w:bidi="ar-SA"/>
+        </w:rPr>
+        <w:t>In the `EXPRESS2` project, I learned the basic use of EJS templates. I practiced setting the view engine, rendering an `index.ejs` page, passing data such as `title`, `message`, and `people`, and including a partial header.</w:t>
+      </w:r>
+    </w:p>
+    <w:p>
+      <w:pPr>
+        <w:rPr>
+          <w:rFonts w:hint="eastAsia" w:ascii="Times New Roman" w:hAnsi="Times New Roman" w:eastAsia="Times New Roman" w:cs="Times New Roman"/>
+          <w:sz w:val="24"/>
+          <w:szCs w:val="24"/>
+          <w:lang w:val="en-US" w:eastAsia="en-US" w:bidi="ar-SA"/>
+        </w:rPr>
+      </w:pPr>
+      <w:r>
+        <w:rPr>
+          <w:rFonts w:hint="eastAsia" w:ascii="Times New Roman" w:hAnsi="Times New Roman" w:eastAsia="Times New Roman" w:cs="Times New Roman"/>
+          <w:sz w:val="24"/>
+          <w:szCs w:val="24"/>
+          <w:lang w:val="en-US" w:eastAsia="en-US" w:bidi="ar-SA"/>
+        </w:rPr>
+        <w:t>Overall, this module helped me understand the basic concepts and usage of Express.js. I now feel more comfortable building simple APIs and web pages with Express.</w:t>
+      </w:r>
     </w:p>
     <w:p>
       <w:pPr>
@@ -2220,8 +2372,26 @@
 </file>
 
 <file path=customXml/item1.xml><?xml version="1.0" encoding="utf-8"?>
-<ct:contentTypeSchema xmlns:ct="http://schemas.microsoft.com/office/2006/metadata/contentType" xmlns:ma="http://schemas.microsoft.com/office/2006/metadata/properties/metaAttributes" ct:_="" ma:_="" ma:contentTypeScope="" ma:versionID="f4b075d3ca74a5dbaed73e767a156aa0" ma:contentTypeName="Asiakirja" ma:contentTypeVersion="1" ma:contentTypeID="0x01010017418C401CCB2042A3A99A19F43F356D" ma:contentTypeDescription="Luo uusi asiakirja.">
-  <xsd:schema xmlns:ns1="http://schemas.microsoft.com/sharepoint/v3" xmlns:xsd="http://www.w3.org/2001/XMLSchema" xmlns:p="http://schemas.microsoft.com/office/2006/metadata/properties" ma:root="true" targetNamespace="http://schemas.microsoft.com/office/2006/metadata/properties" ns1:_="" ma:fieldsID="4340a008e99365d80b71206bae222996">
+<p:properties xmlns:pc="http://schemas.microsoft.com/office/infopath/2007/PartnerControls" xmlns:xsi="http://www.w3.org/2001/XMLSchema-instance" xmlns:p="http://schemas.microsoft.com/office/2006/metadata/properties">
+  <documentManagement>
+    <PublishingExpirationDate xmlns="http://schemas.microsoft.com/sharepoint/v3" xsi:nil="true"/>
+    <PublishingStartDate xmlns="http://schemas.microsoft.com/sharepoint/v3" xsi:nil="true"/>
+  </documentManagement>
+</p:properties>
+</file>
+
+<file path=customXml/item2.xml><?xml version="1.0" encoding="utf-8"?>
+<?mso-contentType ?>
+<FormTemplates xmlns="http://schemas.microsoft.com/sharepoint/v3/contenttype/forms">
+  <Display>DocumentLibraryForm</Display>
+  <Edit>DocumentLibraryForm</Edit>
+  <New>DocumentLibraryForm</New>
+</FormTemplates>
+</file>
+
+<file path=customXml/item3.xml><?xml version="1.0" encoding="utf-8"?>
+<ct:contentTypeSchema xmlns:ct="http://schemas.microsoft.com/office/2006/metadata/contentType" xmlns:ma="http://schemas.microsoft.com/office/2006/metadata/properties/metaAttributes" ma:contentTypeName="Asiakirja" ma:contentTypeScope="" ma:contentTypeVersion="1" ma:contentTypeDescription="Luo uusi asiakirja." ma:contentTypeID="0x01010017418C401CCB2042A3A99A19F43F356D" ct:_="" ma:_="" ma:versionID="f4b075d3ca74a5dbaed73e767a156aa0">
+  <xsd:schema xmlns:ns1="http://schemas.microsoft.com/sharepoint/v3" xmlns:xsd="http://www.w3.org/2001/XMLSchema" xmlns:p="http://schemas.microsoft.com/office/2006/metadata/properties" targetNamespace="http://schemas.microsoft.com/office/2006/metadata/properties" ma:root="true" ma:fieldsID="4340a008e99365d80b71206bae222996" ns1:_="">
     <xsd:import namespace="http://schemas.microsoft.com/sharepoint/v3"/>
     <xsd:element name="properties">
       <xsd:complexType>
@@ -2238,73 +2408,55 @@
       </xsd:complexType>
     </xsd:element>
   </xsd:schema>
-  <xsd:schema xmlns:xsd="http://www.w3.org/2001/XMLSchema" xmlns:dms="http://schemas.microsoft.com/office/2006/documentManagement/types" targetNamespace="http://schemas.microsoft.com/sharepoint/v3" elementFormDefault="qualified">
+  <xsd:schema xmlns:dms="http://schemas.microsoft.com/office/2006/documentManagement/types" xmlns:xsd="http://www.w3.org/2001/XMLSchema" targetNamespace="http://schemas.microsoft.com/sharepoint/v3" elementFormDefault="qualified">
     <xsd:import namespace="http://schemas.microsoft.com/office/2006/documentManagement/types"/>
-    <xsd:element ma:index="8" ma:hidden="true" ma:internalName="PublishingStartDate" ma:displayName="Ajoituksen alkamispäivämäärä" name="PublishingStartDate" ma:description="" nillable="true">
+    <xsd:element ma:index="8" ma:displayName="Ajoituksen alkamispäivämäärä" ma:description="" ma:hidden="true" name="PublishingStartDate" ma:internalName="PublishingStartDate" nillable="true">
       <xsd:simpleType>
         <xsd:restriction base="dms:Unknown"/>
       </xsd:simpleType>
     </xsd:element>
-    <xsd:element ma:index="9" ma:hidden="true" ma:internalName="PublishingExpirationDate" ma:displayName="Ajoituksen päättymispäivämäärä" name="PublishingExpirationDate" ma:description="" nillable="true">
+    <xsd:element ma:index="9" ma:displayName="Ajoituksen päättymispäivämäärä" ma:description="" ma:hidden="true" name="PublishingExpirationDate" ma:internalName="PublishingExpirationDate" nillable="true">
       <xsd:simpleType>
         <xsd:restriction base="dms:Unknown"/>
       </xsd:simpleType>
     </xsd:element>
   </xsd:schema>
-  <xsd:schema xmlns="http://schemas.openxmlformats.org/package/2006/metadata/core-properties" xmlns:dc="http://purl.org/dc/elements/1.1/" xmlns:xsd="http://www.w3.org/2001/XMLSchema" xmlns:odoc="http://schemas.microsoft.com/office/internal/2005/internalDocumentation" xmlns:dcterms="http://purl.org/dc/terms/" xmlns:xsi="http://www.w3.org/2001/XMLSchema-instance" attributeFormDefault="unqualified" targetNamespace="http://schemas.openxmlformats.org/package/2006/metadata/core-properties" elementFormDefault="qualified" blockDefault="#all">
+  <xsd:schema xmlns:xsi="http://www.w3.org/2001/XMLSchema-instance" xmlns="http://schemas.openxmlformats.org/package/2006/metadata/core-properties" xmlns:dc="http://purl.org/dc/elements/1.1/" xmlns:odoc="http://schemas.microsoft.com/office/internal/2005/internalDocumentation" xmlns:xsd="http://www.w3.org/2001/XMLSchema" xmlns:dcterms="http://purl.org/dc/terms/" targetNamespace="http://schemas.openxmlformats.org/package/2006/metadata/core-properties" blockDefault="#all" elementFormDefault="qualified" attributeFormDefault="unqualified">
     <xsd:import schemaLocation="http://dublincore.org/schemas/xmls/qdc/2003/04/02/dc.xsd" namespace="http://purl.org/dc/elements/1.1/"/>
     <xsd:import schemaLocation="http://dublincore.org/schemas/xmls/qdc/2003/04/02/dcterms.xsd" namespace="http://purl.org/dc/terms/"/>
     <xsd:element type="CT_coreProperties" name="coreProperties"/>
     <xsd:complexType name="CT_coreProperties">
       <xsd:all>
-        <xsd:element maxOccurs="1" ref="dc:creator" minOccurs="0"/>
-        <xsd:element maxOccurs="1" ref="dcterms:created" minOccurs="0"/>
-        <xsd:element maxOccurs="1" ref="dc:identifier" minOccurs="0"/>
-        <xsd:element ma:index="0" type="xsd:string" maxOccurs="1" ma:readOnly="true" minOccurs="0" ma:displayName="Sisältölaji" name="contentType"/>
-        <xsd:element ma:index="4" maxOccurs="1" ref="dc:title" minOccurs="0" ma:displayName="Otsikko"/>
-        <xsd:element maxOccurs="1" ref="dc:subject" minOccurs="0"/>
-        <xsd:element maxOccurs="1" ref="dc:description" minOccurs="0"/>
-        <xsd:element type="xsd:string" maxOccurs="1" minOccurs="0" name="keywords"/>
-        <xsd:element maxOccurs="1" ref="dc:language" minOccurs="0"/>
-        <xsd:element type="xsd:string" maxOccurs="1" minOccurs="0" name="category"/>
-        <xsd:element type="xsd:string" maxOccurs="1" minOccurs="0" name="version"/>
-        <xsd:element type="xsd:string" maxOccurs="1" minOccurs="0" name="revision">
+        <xsd:element ref="dc:creator" maxOccurs="1" minOccurs="0"/>
+        <xsd:element ref="dcterms:created" maxOccurs="1" minOccurs="0"/>
+        <xsd:element ref="dc:identifier" maxOccurs="1" minOccurs="0"/>
+        <xsd:element ma:index="0" ma:displayName="Sisältölaji" type="xsd:string" ma:readOnly="true" name="contentType" maxOccurs="1" minOccurs="0"/>
+        <xsd:element ma:index="4" ma:displayName="Otsikko" ref="dc:title" maxOccurs="1" minOccurs="0"/>
+        <xsd:element ref="dc:subject" maxOccurs="1" minOccurs="0"/>
+        <xsd:element ref="dc:description" maxOccurs="1" minOccurs="0"/>
+        <xsd:element type="xsd:string" name="keywords" maxOccurs="1" minOccurs="0"/>
+        <xsd:element ref="dc:language" maxOccurs="1" minOccurs="0"/>
+        <xsd:element type="xsd:string" name="category" maxOccurs="1" minOccurs="0"/>
+        <xsd:element type="xsd:string" name="version" maxOccurs="1" minOccurs="0"/>
+        <xsd:element type="xsd:string" name="revision" maxOccurs="1" minOccurs="0">
           <xsd:annotation>
             <xsd:documentation>
                         This value indicates the number of saves or revisions. The application is responsible for updating this value after each revision.
                     </xsd:documentation>
           </xsd:annotation>
         </xsd:element>
-        <xsd:element type="xsd:string" maxOccurs="1" minOccurs="0" name="lastModifiedBy"/>
-        <xsd:element maxOccurs="1" ref="dcterms:modified" minOccurs="0"/>
-        <xsd:element type="xsd:dateTime" maxOccurs="1" minOccurs="0" name="lastPrinted"/>
-        <xsd:element type="xsd:string" maxOccurs="1" minOccurs="0" name="contentStatus"/>
+        <xsd:element type="xsd:string" name="lastModifiedBy" maxOccurs="1" minOccurs="0"/>
+        <xsd:element ref="dcterms:modified" maxOccurs="1" minOccurs="0"/>
+        <xsd:element type="xsd:dateTime" name="lastPrinted" maxOccurs="1" minOccurs="0"/>
+        <xsd:element type="xsd:string" name="contentStatus" maxOccurs="1" minOccurs="0"/>
       </xsd:all>
     </xsd:complexType>
   </xsd:schema>
 </ct:contentTypeSchema>
 </file>
 
-<file path=customXml/item2.xml><?xml version="1.0" encoding="utf-8"?>
-<?mso-contentType ?>
-<FormTemplates xmlns="http://schemas.microsoft.com/sharepoint/v3/contenttype/forms">
-  <Display>DocumentLibraryForm</Display>
-  <Edit>DocumentLibraryForm</Edit>
-  <New>DocumentLibraryForm</New>
-</FormTemplates>
-</file>
-
-<file path=customXml/item3.xml><?xml version="1.0" encoding="utf-8"?>
-<p:properties xmlns:pc="http://schemas.microsoft.com/office/infopath/2007/PartnerControls" xmlns:xsi="http://www.w3.org/2001/XMLSchema-instance" xmlns:p="http://schemas.microsoft.com/office/2006/metadata/properties">
-  <documentManagement>
-    <PublishingExpirationDate xmlns="http://schemas.microsoft.com/sharepoint/v3" xsi:nil="true"/>
-    <PublishingStartDate xmlns="http://schemas.microsoft.com/sharepoint/v3" xsi:nil="true"/>
-  </documentManagement>
-</p:properties>
-</file>
-
 <file path=customXml/itemProps1.xml><?xml version="1.0" encoding="utf-8"?>
-<ds:datastoreItem xmlns:ds="http://schemas.openxmlformats.org/officeDocument/2006/customXml" ds:itemID="{B9A87442-5A7B-46FD-BD28-170CE9B7256F}">
+<ds:datastoreItem xmlns:ds="http://schemas.openxmlformats.org/officeDocument/2006/customXml" ds:itemID="{FA8F0064-303C-446D-896E-46EEB9A79DC3}">
   <ds:schemaRefs/>
 </ds:datastoreItem>
 </file>
@@ -2316,7 +2468,7 @@
 </file>
 
 <file path=customXml/itemProps3.xml><?xml version="1.0" encoding="utf-8"?>
-<ds:datastoreItem xmlns:ds="http://schemas.openxmlformats.org/officeDocument/2006/customXml" ds:itemID="{FA8F0064-303C-446D-896E-46EEB9A79DC3}">
+<ds:datastoreItem xmlns:ds="http://schemas.openxmlformats.org/officeDocument/2006/customXml" ds:itemID="{B9A87442-5A7B-46FD-BD28-170CE9B7256F}">
   <ds:schemaRefs/>
 </ds:datastoreItem>
 </file>
</xml_diff>

<commit_message>
Add React task tracker project
</commit_message>
<xml_diff>
--- a/SDS_learning_diary_template.docx
+++ b/SDS_learning_diary_template.docx
@@ -644,92 +644,93 @@
           <w:lang w:val="en-US" w:eastAsia="en-US" w:bidi="ar-SA"/>
         </w:rPr>
       </w:pPr>
-      <w:r>
-        <w:rPr>
-          <w:rFonts w:hint="eastAsia" w:ascii="Times New Roman" w:hAnsi="Times New Roman" w:eastAsia="Times New Roman" w:cs="Times New Roman"/>
-          <w:sz w:val="24"/>
-          <w:szCs w:val="24"/>
-          <w:lang w:val="en-US" w:eastAsia="en-US" w:bidi="ar-SA"/>
-        </w:rPr>
-        <w:t>Express JS</w:t>
-      </w:r>
-    </w:p>
-    <w:p>
-      <w:pPr>
-        <w:rPr>
-          <w:rFonts w:hint="eastAsia" w:ascii="Times New Roman" w:hAnsi="Times New Roman" w:eastAsia="Times New Roman" w:cs="Times New Roman"/>
-          <w:sz w:val="24"/>
-          <w:szCs w:val="24"/>
-          <w:lang w:val="en-US" w:eastAsia="en-US" w:bidi="ar-SA"/>
-        </w:rPr>
-      </w:pPr>
-    </w:p>
-    <w:p>
-      <w:pPr>
-        <w:rPr>
-          <w:rFonts w:hint="eastAsia" w:ascii="Times New Roman" w:hAnsi="Times New Roman" w:eastAsia="Times New Roman" w:cs="Times New Roman"/>
-          <w:sz w:val="24"/>
-          <w:szCs w:val="24"/>
-          <w:lang w:val="en-US" w:eastAsia="en-US" w:bidi="ar-SA"/>
-        </w:rPr>
-      </w:pPr>
-      <w:r>
-        <w:rPr>
-          <w:rFonts w:hint="eastAsia" w:ascii="Times New Roman" w:hAnsi="Times New Roman" w:eastAsia="Times New Roman" w:cs="Times New Roman"/>
-          <w:sz w:val="24"/>
-          <w:szCs w:val="24"/>
-          <w:lang w:val="en-US" w:eastAsia="en-US" w:bidi="ar-SA"/>
-        </w:rPr>
-        <w:t>Today I studied the Express JS Crash Course and followed the `EXPRESS-CRASH` and `EXPRESS2` projects. I learned that Express.js is a framework for Node.js that makes it easier to create web servers, routes, APIs, and middleware.</w:t>
-      </w:r>
-    </w:p>
-    <w:p>
-      <w:pPr>
-        <w:rPr>
-          <w:rFonts w:hint="eastAsia" w:ascii="Times New Roman" w:hAnsi="Times New Roman" w:eastAsia="Times New Roman" w:cs="Times New Roman"/>
-          <w:sz w:val="24"/>
-          <w:szCs w:val="24"/>
-          <w:lang w:val="en-US" w:eastAsia="en-US" w:bidi="ar-SA"/>
-        </w:rPr>
-      </w:pPr>
-      <w:r>
-        <w:rPr>
-          <w:rFonts w:hint="eastAsia" w:ascii="Times New Roman" w:hAnsi="Times New Roman" w:eastAsia="Times New Roman" w:cs="Times New Roman"/>
-          <w:sz w:val="24"/>
-          <w:szCs w:val="24"/>
-          <w:lang w:val="en-US" w:eastAsia="en-US" w:bidi="ar-SA"/>
-        </w:rPr>
-        <w:t>In the `EXPRESS-CRASH` project, I learned how to create an Express server with `express()`, set up middleware with `app.use()`, and serve static files from the `public` folder. I also learned how to use `express.json()` and `express.urlencoded()` to read request body data.</w:t>
-      </w:r>
-    </w:p>
-    <w:p>
-      <w:pPr>
-        <w:rPr>
-          <w:rFonts w:hint="eastAsia" w:ascii="Times New Roman" w:hAnsi="Times New Roman" w:eastAsia="Times New Roman" w:cs="Times New Roman"/>
-          <w:sz w:val="24"/>
-          <w:szCs w:val="24"/>
-          <w:lang w:val="en-US" w:eastAsia="en-US" w:bidi="ar-SA"/>
-        </w:rPr>
-      </w:pPr>
-      <w:r>
-        <w:rPr>
-          <w:rFonts w:hint="eastAsia" w:ascii="Times New Roman" w:hAnsi="Times New Roman" w:eastAsia="Times New Roman" w:cs="Times New Roman"/>
-          <w:sz w:val="24"/>
-          <w:szCs w:val="24"/>
-          <w:lang w:val="en-US" w:eastAsia="en-US" w:bidi="ar-SA"/>
-        </w:rPr>
-        <w:t>I practiced routing by creatin</w:t>
-      </w:r>
       <w:bookmarkStart w:id="0" w:name="_GoBack"/>
       <w:bookmarkEnd w:id="0"/>
-      <w:r>
-        <w:rPr>
-          <w:rFonts w:hint="eastAsia" w:ascii="Times New Roman" w:hAnsi="Times New Roman" w:eastAsia="Times New Roman" w:cs="Times New Roman"/>
-          <w:sz w:val="24"/>
-          <w:szCs w:val="24"/>
-          <w:lang w:val="en-US" w:eastAsia="en-US" w:bidi="ar-SA"/>
-        </w:rPr>
-        <w:t>g `/api/posts` routes. I learned how to use `GET`, `POST`, `PUT`, and `DELETE` requests to read, create, update, and delete post data. I also learned how route parameters like `/:id` and query parameters like `?limit=2` work.</w:t>
+    </w:p>
+    <w:p>
+      <w:pPr>
+        <w:rPr>
+          <w:rFonts w:hint="eastAsia" w:ascii="Times New Roman" w:hAnsi="Times New Roman" w:eastAsia="Times New Roman" w:cs="Times New Roman"/>
+          <w:sz w:val="24"/>
+          <w:szCs w:val="24"/>
+          <w:lang w:val="en-US" w:eastAsia="en-US" w:bidi="ar-SA"/>
+        </w:rPr>
+      </w:pPr>
+      <w:r>
+        <w:rPr>
+          <w:rFonts w:hint="eastAsia" w:ascii="Times New Roman" w:hAnsi="Times New Roman" w:eastAsia="Times New Roman" w:cs="Times New Roman"/>
+          <w:sz w:val="24"/>
+          <w:szCs w:val="24"/>
+          <w:lang w:val="en-US" w:eastAsia="en-US" w:bidi="ar-SA"/>
+        </w:rPr>
+        <w:t>Express JS</w:t>
+      </w:r>
+    </w:p>
+    <w:p>
+      <w:pPr>
+        <w:rPr>
+          <w:rFonts w:hint="eastAsia" w:ascii="Times New Roman" w:hAnsi="Times New Roman" w:eastAsia="Times New Roman" w:cs="Times New Roman"/>
+          <w:sz w:val="24"/>
+          <w:szCs w:val="24"/>
+          <w:lang w:val="en-US" w:eastAsia="en-US" w:bidi="ar-SA"/>
+        </w:rPr>
+      </w:pPr>
+    </w:p>
+    <w:p>
+      <w:pPr>
+        <w:rPr>
+          <w:rFonts w:hint="eastAsia" w:ascii="Times New Roman" w:hAnsi="Times New Roman" w:eastAsia="Times New Roman" w:cs="Times New Roman"/>
+          <w:sz w:val="24"/>
+          <w:szCs w:val="24"/>
+          <w:lang w:val="en-US" w:eastAsia="en-US" w:bidi="ar-SA"/>
+        </w:rPr>
+      </w:pPr>
+      <w:r>
+        <w:rPr>
+          <w:rFonts w:hint="eastAsia" w:ascii="Times New Roman" w:hAnsi="Times New Roman" w:eastAsia="Times New Roman" w:cs="Times New Roman"/>
+          <w:sz w:val="24"/>
+          <w:szCs w:val="24"/>
+          <w:lang w:val="en-US" w:eastAsia="en-US" w:bidi="ar-SA"/>
+        </w:rPr>
+        <w:t>Today I studied the Express JS Crash Course and followed the `EXPRESS-CRASH` and `EXPRESS2` projects. I learned that Express.js is a framework for Node.js that makes it easier to create web servers, routes, APIs, and middleware.</w:t>
+      </w:r>
+    </w:p>
+    <w:p>
+      <w:pPr>
+        <w:rPr>
+          <w:rFonts w:hint="eastAsia" w:ascii="Times New Roman" w:hAnsi="Times New Roman" w:eastAsia="Times New Roman" w:cs="Times New Roman"/>
+          <w:sz w:val="24"/>
+          <w:szCs w:val="24"/>
+          <w:lang w:val="en-US" w:eastAsia="en-US" w:bidi="ar-SA"/>
+        </w:rPr>
+      </w:pPr>
+      <w:r>
+        <w:rPr>
+          <w:rFonts w:hint="eastAsia" w:ascii="Times New Roman" w:hAnsi="Times New Roman" w:eastAsia="Times New Roman" w:cs="Times New Roman"/>
+          <w:sz w:val="24"/>
+          <w:szCs w:val="24"/>
+          <w:lang w:val="en-US" w:eastAsia="en-US" w:bidi="ar-SA"/>
+        </w:rPr>
+        <w:t>In the `EXPRESS-CRASH` project, I learned how to create an Express server with `express()`, set up middleware with `app.use()`, and serve static files from the `public` folder. I also learned how to use `express.json()` and `express.urlencoded()` to read request body data.</w:t>
+      </w:r>
+    </w:p>
+    <w:p>
+      <w:pPr>
+        <w:rPr>
+          <w:rFonts w:hint="eastAsia" w:ascii="Times New Roman" w:hAnsi="Times New Roman" w:eastAsia="Times New Roman" w:cs="Times New Roman"/>
+          <w:sz w:val="24"/>
+          <w:szCs w:val="24"/>
+          <w:lang w:val="en-US" w:eastAsia="en-US" w:bidi="ar-SA"/>
+        </w:rPr>
+      </w:pPr>
+      <w:r>
+        <w:rPr>
+          <w:rFonts w:hint="eastAsia" w:ascii="Times New Roman" w:hAnsi="Times New Roman" w:eastAsia="Times New Roman" w:cs="Times New Roman"/>
+          <w:sz w:val="24"/>
+          <w:szCs w:val="24"/>
+          <w:lang w:val="en-US" w:eastAsia="en-US" w:bidi="ar-SA"/>
+        </w:rPr>
+        <w:t>I practiced routing by creating `/api/posts` routes. I learned how to use `GET`, `POST`, `PUT`, and `DELETE` requests to read, create, update, and delete post data. I also learned how route parameters like `/:id` and query parameters like `?limit=2` work.</w:t>
       </w:r>
     </w:p>
     <w:p>
@@ -795,6 +796,140 @@
           <w:lang w:val="en-US"/>
         </w:rPr>
       </w:pPr>
+    </w:p>
+    <w:p>
+      <w:pPr>
+        <w:rPr>
+          <w:lang w:val="en-US"/>
+        </w:rPr>
+      </w:pPr>
+    </w:p>
+    <w:p>
+      <w:pPr>
+        <w:rPr>
+          <w:rFonts w:hint="default"/>
+          <w:lang w:val="en-US"/>
+        </w:rPr>
+      </w:pPr>
+      <w:r>
+        <w:rPr>
+          <w:rFonts w:hint="default"/>
+          <w:lang w:val="en-US"/>
+        </w:rPr>
+        <w:t>React</w:t>
+      </w:r>
+    </w:p>
+    <w:p>
+      <w:pPr>
+        <w:rPr>
+          <w:rFonts w:hint="default"/>
+          <w:lang w:val="en-US"/>
+        </w:rPr>
+      </w:pPr>
+    </w:p>
+    <w:p>
+      <w:pPr>
+        <w:rPr>
+          <w:rFonts w:hint="eastAsia"/>
+          <w:lang w:val="en-US"/>
+        </w:rPr>
+      </w:pPr>
+      <w:r>
+        <w:rPr>
+          <w:rFonts w:hint="eastAsia"/>
+          <w:lang w:val="en-US"/>
+        </w:rPr>
+        <w:t>Today I studied React fundamentals from the React Docs and React Crash Course. I followed the `REACT-TASK-TRACKER` project to understand how a React application is built with components, state, hooks, events, JSON Server, and routing.</w:t>
+      </w:r>
+    </w:p>
+    <w:p>
+      <w:pPr>
+        <w:rPr>
+          <w:rFonts w:hint="eastAsia"/>
+          <w:lang w:val="en-US"/>
+        </w:rPr>
+      </w:pPr>
+      <w:r>
+        <w:rPr>
+          <w:rFonts w:hint="eastAsia"/>
+          <w:lang w:val="en-US"/>
+        </w:rPr>
+        <w:t>I learned how to split the UI into reusable components, such as `Header`, `Button`, `Tasks`, `Task`, `AddTask`, `Footer`, and `About`. This helped me understand that React applications are built from small components that pass data using props.</w:t>
+      </w:r>
+    </w:p>
+    <w:p>
+      <w:pPr>
+        <w:rPr>
+          <w:rFonts w:hint="eastAsia"/>
+          <w:lang w:val="en-US"/>
+        </w:rPr>
+      </w:pPr>
+      <w:r>
+        <w:rPr>
+          <w:rFonts w:hint="eastAsia"/>
+          <w:lang w:val="en-US"/>
+        </w:rPr>
+        <w:t>I practiced using state and hooks. In `App.js`, I used `useState` to store tasks and control whether the add task form is shown. I also used `useEffect` to load task data when the page first opens. In `AddTask.js`, I learned how form inputs can be controlled with state.</w:t>
+      </w:r>
+    </w:p>
+    <w:p>
+      <w:pPr>
+        <w:rPr>
+          <w:rFonts w:hint="eastAsia"/>
+          <w:lang w:val="en-US"/>
+        </w:rPr>
+      </w:pPr>
+      <w:r>
+        <w:rPr>
+          <w:rFonts w:hint="eastAsia"/>
+          <w:lang w:val="en-US"/>
+        </w:rPr>
+        <w:t>I also learned how events work in React. I practiced clicking the Add button, submitting a form, deleting a task with an icon, and double-clicking a task to toggle its reminder status.</w:t>
+      </w:r>
+    </w:p>
+    <w:p>
+      <w:pPr>
+        <w:rPr>
+          <w:rFonts w:hint="eastAsia"/>
+          <w:lang w:val="en-US"/>
+        </w:rPr>
+      </w:pPr>
+      <w:r>
+        <w:rPr>
+          <w:rFonts w:hint="eastAsia"/>
+          <w:lang w:val="en-US"/>
+        </w:rPr>
+        <w:t>Another important part was using JSON Server. The project used `db.json` as a simple backend, and I practiced fetching tasks, adding new tasks with `POST`, updating reminders with `PUT`, and deleting tasks with `DELETE`.</w:t>
+      </w:r>
+    </w:p>
+    <w:p>
+      <w:pPr>
+        <w:rPr>
+          <w:rFonts w:hint="eastAsia"/>
+          <w:lang w:val="en-US"/>
+        </w:rPr>
+      </w:pPr>
+      <w:r>
+        <w:rPr>
+          <w:rFonts w:hint="eastAsia"/>
+          <w:lang w:val="en-US"/>
+        </w:rPr>
+        <w:t>Finally, I learned basic routing with `react-router-dom`. The app used routes for the main task page and the About page, and the footer link allowed navigation without refreshing the page.</w:t>
+      </w:r>
+    </w:p>
+    <w:p>
+      <w:pPr>
+        <w:rPr>
+          <w:lang w:val="en-US"/>
+        </w:rPr>
+      </w:pPr>
+      <w:r>
+        <w:rPr>
+          <w:rFonts w:hint="eastAsia"/>
+          <w:lang w:val="en-US"/>
+        </w:rPr>
+        <w:t>Overall, this module helped me understand the basic structure of React projects. I now feel more comfortable working with components, props, state, hooks, events, simple APIs, and routing.</w:t>
+      </w:r>
     </w:p>
     <w:p>
       <w:pPr>
@@ -2372,26 +2507,8 @@
 </file>
 
 <file path=customXml/item1.xml><?xml version="1.0" encoding="utf-8"?>
-<p:properties xmlns:pc="http://schemas.microsoft.com/office/infopath/2007/PartnerControls" xmlns:xsi="http://www.w3.org/2001/XMLSchema-instance" xmlns:p="http://schemas.microsoft.com/office/2006/metadata/properties">
-  <documentManagement>
-    <PublishingExpirationDate xmlns="http://schemas.microsoft.com/sharepoint/v3" xsi:nil="true"/>
-    <PublishingStartDate xmlns="http://schemas.microsoft.com/sharepoint/v3" xsi:nil="true"/>
-  </documentManagement>
-</p:properties>
-</file>
-
-<file path=customXml/item2.xml><?xml version="1.0" encoding="utf-8"?>
-<?mso-contentType ?>
-<FormTemplates xmlns="http://schemas.microsoft.com/sharepoint/v3/contenttype/forms">
-  <Display>DocumentLibraryForm</Display>
-  <Edit>DocumentLibraryForm</Edit>
-  <New>DocumentLibraryForm</New>
-</FormTemplates>
-</file>
-
-<file path=customXml/item3.xml><?xml version="1.0" encoding="utf-8"?>
-<ct:contentTypeSchema xmlns:ct="http://schemas.microsoft.com/office/2006/metadata/contentType" xmlns:ma="http://schemas.microsoft.com/office/2006/metadata/properties/metaAttributes" ma:contentTypeName="Asiakirja" ma:contentTypeScope="" ma:contentTypeVersion="1" ma:contentTypeDescription="Luo uusi asiakirja." ma:contentTypeID="0x01010017418C401CCB2042A3A99A19F43F356D" ct:_="" ma:_="" ma:versionID="f4b075d3ca74a5dbaed73e767a156aa0">
-  <xsd:schema xmlns:ns1="http://schemas.microsoft.com/sharepoint/v3" xmlns:xsd="http://www.w3.org/2001/XMLSchema" xmlns:p="http://schemas.microsoft.com/office/2006/metadata/properties" targetNamespace="http://schemas.microsoft.com/office/2006/metadata/properties" ma:root="true" ma:fieldsID="4340a008e99365d80b71206bae222996" ns1:_="">
+<ct:contentTypeSchema xmlns:ct="http://schemas.microsoft.com/office/2006/metadata/contentType" xmlns:ma="http://schemas.microsoft.com/office/2006/metadata/properties/metaAttributes" ma:contentTypeVersion="1" ma:versionID="f4b075d3ca74a5dbaed73e767a156aa0" ma:contentTypeScope="" ma:contentTypeID="0x01010017418C401CCB2042A3A99A19F43F356D" ma:contentTypeName="Asiakirja" ma:contentTypeDescription="Luo uusi asiakirja." ct:_="" ma:_="">
+  <xsd:schema xmlns:p="http://schemas.microsoft.com/office/2006/metadata/properties" xmlns:ns1="http://schemas.microsoft.com/sharepoint/v3" xmlns:xsd="http://www.w3.org/2001/XMLSchema" ma:fieldsID="4340a008e99365d80b71206bae222996" ns1:_="" ma:root="true" targetNamespace="http://schemas.microsoft.com/office/2006/metadata/properties">
     <xsd:import namespace="http://schemas.microsoft.com/sharepoint/v3"/>
     <xsd:element name="properties">
       <xsd:complexType>
@@ -2408,20 +2525,20 @@
       </xsd:complexType>
     </xsd:element>
   </xsd:schema>
-  <xsd:schema xmlns:dms="http://schemas.microsoft.com/office/2006/documentManagement/types" xmlns:xsd="http://www.w3.org/2001/XMLSchema" targetNamespace="http://schemas.microsoft.com/sharepoint/v3" elementFormDefault="qualified">
+  <xsd:schema xmlns:xsd="http://www.w3.org/2001/XMLSchema" xmlns:dms="http://schemas.microsoft.com/office/2006/documentManagement/types" targetNamespace="http://schemas.microsoft.com/sharepoint/v3" elementFormDefault="qualified">
     <xsd:import namespace="http://schemas.microsoft.com/office/2006/documentManagement/types"/>
-    <xsd:element ma:index="8" ma:displayName="Ajoituksen alkamispäivämäärä" ma:description="" ma:hidden="true" name="PublishingStartDate" ma:internalName="PublishingStartDate" nillable="true">
+    <xsd:element ma:index="8" ma:internalName="PublishingStartDate" ma:hidden="true" name="PublishingStartDate" ma:displayName="Ajoituksen alkamispäivämäärä" ma:description="" nillable="true">
       <xsd:simpleType>
         <xsd:restriction base="dms:Unknown"/>
       </xsd:simpleType>
     </xsd:element>
-    <xsd:element ma:index="9" ma:displayName="Ajoituksen päättymispäivämäärä" ma:description="" ma:hidden="true" name="PublishingExpirationDate" ma:internalName="PublishingExpirationDate" nillable="true">
+    <xsd:element ma:index="9" ma:internalName="PublishingExpirationDate" ma:hidden="true" name="PublishingExpirationDate" ma:displayName="Ajoituksen päättymispäivämäärä" ma:description="" nillable="true">
       <xsd:simpleType>
         <xsd:restriction base="dms:Unknown"/>
       </xsd:simpleType>
     </xsd:element>
   </xsd:schema>
-  <xsd:schema xmlns:xsi="http://www.w3.org/2001/XMLSchema-instance" xmlns="http://schemas.openxmlformats.org/package/2006/metadata/core-properties" xmlns:dc="http://purl.org/dc/elements/1.1/" xmlns:odoc="http://schemas.microsoft.com/office/internal/2005/internalDocumentation" xmlns:xsd="http://www.w3.org/2001/XMLSchema" xmlns:dcterms="http://purl.org/dc/terms/" targetNamespace="http://schemas.openxmlformats.org/package/2006/metadata/core-properties" blockDefault="#all" elementFormDefault="qualified" attributeFormDefault="unqualified">
+  <xsd:schema xmlns:dc="http://purl.org/dc/elements/1.1/" xmlns:dcterms="http://purl.org/dc/terms/" xmlns:xsd="http://www.w3.org/2001/XMLSchema" xmlns="http://schemas.openxmlformats.org/package/2006/metadata/core-properties" xmlns:odoc="http://schemas.microsoft.com/office/internal/2005/internalDocumentation" xmlns:xsi="http://www.w3.org/2001/XMLSchema-instance" targetNamespace="http://schemas.openxmlformats.org/package/2006/metadata/core-properties" attributeFormDefault="unqualified" elementFormDefault="qualified" blockDefault="#all">
     <xsd:import schemaLocation="http://dublincore.org/schemas/xmls/qdc/2003/04/02/dc.xsd" namespace="http://purl.org/dc/elements/1.1/"/>
     <xsd:import schemaLocation="http://dublincore.org/schemas/xmls/qdc/2003/04/02/dcterms.xsd" namespace="http://purl.org/dc/terms/"/>
     <xsd:element type="CT_coreProperties" name="coreProperties"/>
@@ -2430,8 +2547,8 @@
         <xsd:element ref="dc:creator" maxOccurs="1" minOccurs="0"/>
         <xsd:element ref="dcterms:created" maxOccurs="1" minOccurs="0"/>
         <xsd:element ref="dc:identifier" maxOccurs="1" minOccurs="0"/>
-        <xsd:element ma:index="0" ma:displayName="Sisältölaji" type="xsd:string" ma:readOnly="true" name="contentType" maxOccurs="1" minOccurs="0"/>
-        <xsd:element ma:index="4" ma:displayName="Otsikko" ref="dc:title" maxOccurs="1" minOccurs="0"/>
+        <xsd:element ma:index="0" ma:readOnly="true" type="xsd:string" name="contentType" maxOccurs="1" minOccurs="0" ma:displayName="Sisältölaji"/>
+        <xsd:element ma:index="4" ref="dc:title" maxOccurs="1" minOccurs="0" ma:displayName="Otsikko"/>
         <xsd:element ref="dc:subject" maxOccurs="1" minOccurs="0"/>
         <xsd:element ref="dc:description" maxOccurs="1" minOccurs="0"/>
         <xsd:element type="xsd:string" name="keywords" maxOccurs="1" minOccurs="0"/>
@@ -2455,8 +2572,26 @@
 </ct:contentTypeSchema>
 </file>
 
+<file path=customXml/item2.xml><?xml version="1.0" encoding="utf-8"?>
+<?mso-contentType ?>
+<FormTemplates xmlns="http://schemas.microsoft.com/sharepoint/v3/contenttype/forms">
+  <Display>DocumentLibraryForm</Display>
+  <Edit>DocumentLibraryForm</Edit>
+  <New>DocumentLibraryForm</New>
+</FormTemplates>
+</file>
+
+<file path=customXml/item3.xml><?xml version="1.0" encoding="utf-8"?>
+<p:properties xmlns:pc="http://schemas.microsoft.com/office/infopath/2007/PartnerControls" xmlns:p="http://schemas.microsoft.com/office/2006/metadata/properties" xmlns:xsi="http://www.w3.org/2001/XMLSchema-instance">
+  <documentManagement>
+    <PublishingExpirationDate xmlns="http://schemas.microsoft.com/sharepoint/v3" xsi:nil="true"/>
+    <PublishingStartDate xmlns="http://schemas.microsoft.com/sharepoint/v3" xsi:nil="true"/>
+  </documentManagement>
+</p:properties>
+</file>
+
 <file path=customXml/itemProps1.xml><?xml version="1.0" encoding="utf-8"?>
-<ds:datastoreItem xmlns:ds="http://schemas.openxmlformats.org/officeDocument/2006/customXml" ds:itemID="{FA8F0064-303C-446D-896E-46EEB9A79DC3}">
+<ds:datastoreItem xmlns:ds="http://schemas.openxmlformats.org/officeDocument/2006/customXml" ds:itemID="{B9A87442-5A7B-46FD-BD28-170CE9B7256F}">
   <ds:schemaRefs/>
 </ds:datastoreItem>
 </file>
@@ -2468,7 +2603,7 @@
 </file>
 
 <file path=customXml/itemProps3.xml><?xml version="1.0" encoding="utf-8"?>
-<ds:datastoreItem xmlns:ds="http://schemas.openxmlformats.org/officeDocument/2006/customXml" ds:itemID="{B9A87442-5A7B-46FD-BD28-170CE9B7256F}">
+<ds:datastoreItem xmlns:ds="http://schemas.openxmlformats.org/officeDocument/2006/customXml" ds:itemID="{FA8F0064-303C-446D-896E-46EEB9A79DC3}">
   <ds:schemaRefs/>
 </ds:datastoreItem>
 </file>
</xml_diff>

<commit_message>
Add MERN tutorial project
</commit_message>
<xml_diff>
--- a/SDS_learning_diary_template.docx
+++ b/SDS_learning_diary_template.docx
@@ -644,291 +644,450 @@
           <w:lang w:val="en-US" w:eastAsia="en-US" w:bidi="ar-SA"/>
         </w:rPr>
       </w:pPr>
+    </w:p>
+    <w:p>
+      <w:pPr>
+        <w:rPr>
+          <w:rFonts w:hint="eastAsia" w:ascii="Times New Roman" w:hAnsi="Times New Roman" w:eastAsia="Times New Roman" w:cs="Times New Roman"/>
+          <w:sz w:val="24"/>
+          <w:szCs w:val="24"/>
+          <w:lang w:val="en-US" w:eastAsia="en-US" w:bidi="ar-SA"/>
+        </w:rPr>
+      </w:pPr>
+      <w:r>
+        <w:rPr>
+          <w:rFonts w:hint="eastAsia" w:ascii="Times New Roman" w:hAnsi="Times New Roman" w:eastAsia="Times New Roman" w:cs="Times New Roman"/>
+          <w:sz w:val="24"/>
+          <w:szCs w:val="24"/>
+          <w:lang w:val="en-US" w:eastAsia="en-US" w:bidi="ar-SA"/>
+        </w:rPr>
+        <w:t>Express JS</w:t>
+      </w:r>
+    </w:p>
+    <w:p>
+      <w:pPr>
+        <w:rPr>
+          <w:rFonts w:hint="eastAsia" w:ascii="Times New Roman" w:hAnsi="Times New Roman" w:eastAsia="Times New Roman" w:cs="Times New Roman"/>
+          <w:sz w:val="24"/>
+          <w:szCs w:val="24"/>
+          <w:lang w:val="en-US" w:eastAsia="en-US" w:bidi="ar-SA"/>
+        </w:rPr>
+      </w:pPr>
+    </w:p>
+    <w:p>
+      <w:pPr>
+        <w:rPr>
+          <w:rFonts w:hint="eastAsia" w:ascii="Times New Roman" w:hAnsi="Times New Roman" w:eastAsia="Times New Roman" w:cs="Times New Roman"/>
+          <w:sz w:val="24"/>
+          <w:szCs w:val="24"/>
+          <w:lang w:val="en-US" w:eastAsia="en-US" w:bidi="ar-SA"/>
+        </w:rPr>
+      </w:pPr>
+      <w:r>
+        <w:rPr>
+          <w:rFonts w:hint="eastAsia" w:ascii="Times New Roman" w:hAnsi="Times New Roman" w:eastAsia="Times New Roman" w:cs="Times New Roman"/>
+          <w:sz w:val="24"/>
+          <w:szCs w:val="24"/>
+          <w:lang w:val="en-US" w:eastAsia="en-US" w:bidi="ar-SA"/>
+        </w:rPr>
+        <w:t>Today I studied the Express JS Crash Course and followed the `EXPRESS-CRASH` and `EXPRESS2` projects. I learned that Express.js is a framework for Node.js that makes it easier to create web servers, routes, APIs, and middleware.</w:t>
+      </w:r>
+    </w:p>
+    <w:p>
+      <w:pPr>
+        <w:rPr>
+          <w:rFonts w:hint="eastAsia" w:ascii="Times New Roman" w:hAnsi="Times New Roman" w:eastAsia="Times New Roman" w:cs="Times New Roman"/>
+          <w:sz w:val="24"/>
+          <w:szCs w:val="24"/>
+          <w:lang w:val="en-US" w:eastAsia="en-US" w:bidi="ar-SA"/>
+        </w:rPr>
+      </w:pPr>
+      <w:r>
+        <w:rPr>
+          <w:rFonts w:hint="eastAsia" w:ascii="Times New Roman" w:hAnsi="Times New Roman" w:eastAsia="Times New Roman" w:cs="Times New Roman"/>
+          <w:sz w:val="24"/>
+          <w:szCs w:val="24"/>
+          <w:lang w:val="en-US" w:eastAsia="en-US" w:bidi="ar-SA"/>
+        </w:rPr>
+        <w:t>In the `EXPRESS-CRASH` project, I learned how to create an Express server with `express()`, set up middleware with `app.use()`, and serve static files from the `public` folder. I also learned how to use `express.json()` and `express.urlencoded()` to read request body data.</w:t>
+      </w:r>
+    </w:p>
+    <w:p>
+      <w:pPr>
+        <w:rPr>
+          <w:rFonts w:hint="eastAsia" w:ascii="Times New Roman" w:hAnsi="Times New Roman" w:eastAsia="Times New Roman" w:cs="Times New Roman"/>
+          <w:sz w:val="24"/>
+          <w:szCs w:val="24"/>
+          <w:lang w:val="en-US" w:eastAsia="en-US" w:bidi="ar-SA"/>
+        </w:rPr>
+      </w:pPr>
+      <w:r>
+        <w:rPr>
+          <w:rFonts w:hint="eastAsia" w:ascii="Times New Roman" w:hAnsi="Times New Roman" w:eastAsia="Times New Roman" w:cs="Times New Roman"/>
+          <w:sz w:val="24"/>
+          <w:szCs w:val="24"/>
+          <w:lang w:val="en-US" w:eastAsia="en-US" w:bidi="ar-SA"/>
+        </w:rPr>
+        <w:t>I practiced routing by creating `/api/posts` routes. I learned how to use `GET`, `POST`, `PUT`, and `DELETE` requests to read, create, update, and delete post data. I also learned how route parameters like `/:id` and query parameters like `?limit=2` work.</w:t>
+      </w:r>
+    </w:p>
+    <w:p>
+      <w:pPr>
+        <w:rPr>
+          <w:rFonts w:hint="eastAsia" w:ascii="Times New Roman" w:hAnsi="Times New Roman" w:eastAsia="Times New Roman" w:cs="Times New Roman"/>
+          <w:sz w:val="24"/>
+          <w:szCs w:val="24"/>
+          <w:lang w:val="en-US" w:eastAsia="en-US" w:bidi="ar-SA"/>
+        </w:rPr>
+      </w:pPr>
+      <w:r>
+        <w:rPr>
+          <w:rFonts w:hint="eastAsia" w:ascii="Times New Roman" w:hAnsi="Times New Roman" w:eastAsia="Times New Roman" w:cs="Times New Roman"/>
+          <w:sz w:val="24"/>
+          <w:szCs w:val="24"/>
+          <w:lang w:val="en-US" w:eastAsia="en-US" w:bidi="ar-SA"/>
+        </w:rPr>
+        <w:t>I also learned how to organize Express code better by separating routes, controllers, and middleware. The controller file handled the main logic, while middleware files handled logging, 404 errors, and general error responses.</w:t>
+      </w:r>
+    </w:p>
+    <w:p>
+      <w:pPr>
+        <w:rPr>
+          <w:rFonts w:hint="eastAsia" w:ascii="Times New Roman" w:hAnsi="Times New Roman" w:eastAsia="Times New Roman" w:cs="Times New Roman"/>
+          <w:sz w:val="24"/>
+          <w:szCs w:val="24"/>
+          <w:lang w:val="en-US" w:eastAsia="en-US" w:bidi="ar-SA"/>
+        </w:rPr>
+      </w:pPr>
+      <w:r>
+        <w:rPr>
+          <w:rFonts w:hint="eastAsia" w:ascii="Times New Roman" w:hAnsi="Times New Roman" w:eastAsia="Times New Roman" w:cs="Times New Roman"/>
+          <w:sz w:val="24"/>
+          <w:szCs w:val="24"/>
+          <w:lang w:val="en-US" w:eastAsia="en-US" w:bidi="ar-SA"/>
+        </w:rPr>
+        <w:t>In the `EXPRESS2` project, I learned the basic use of EJS templates. I practiced setting the view engine, rendering an `index.ejs` page, passing data such as `title`, `message`, and `people`, and including a partial header.</w:t>
+      </w:r>
+    </w:p>
+    <w:p>
+      <w:pPr>
+        <w:rPr>
+          <w:rFonts w:hint="eastAsia" w:ascii="Times New Roman" w:hAnsi="Times New Roman" w:eastAsia="Times New Roman" w:cs="Times New Roman"/>
+          <w:sz w:val="24"/>
+          <w:szCs w:val="24"/>
+          <w:lang w:val="en-US" w:eastAsia="en-US" w:bidi="ar-SA"/>
+        </w:rPr>
+      </w:pPr>
+      <w:r>
+        <w:rPr>
+          <w:rFonts w:hint="eastAsia" w:ascii="Times New Roman" w:hAnsi="Times New Roman" w:eastAsia="Times New Roman" w:cs="Times New Roman"/>
+          <w:sz w:val="24"/>
+          <w:szCs w:val="24"/>
+          <w:lang w:val="en-US" w:eastAsia="en-US" w:bidi="ar-SA"/>
+        </w:rPr>
+        <w:t>Overall, this module helped me understand the basic concepts and usage of Express.js. I now feel more comfortable building simple APIs and web pages with Express.</w:t>
+      </w:r>
+    </w:p>
+    <w:p>
+      <w:pPr>
+        <w:rPr>
+          <w:lang w:val="en-US"/>
+        </w:rPr>
+      </w:pPr>
+    </w:p>
+    <w:p>
+      <w:pPr>
+        <w:rPr>
+          <w:lang w:val="en-US"/>
+        </w:rPr>
+      </w:pPr>
+    </w:p>
+    <w:p>
+      <w:pPr>
+        <w:rPr>
+          <w:rFonts w:hint="default"/>
+          <w:lang w:val="en-US"/>
+        </w:rPr>
+      </w:pPr>
+      <w:r>
+        <w:rPr>
+          <w:rFonts w:hint="default"/>
+          <w:lang w:val="en-US"/>
+        </w:rPr>
+        <w:t>React</w:t>
+      </w:r>
+    </w:p>
+    <w:p>
+      <w:pPr>
+        <w:rPr>
+          <w:rFonts w:hint="default"/>
+          <w:lang w:val="en-US"/>
+        </w:rPr>
+      </w:pPr>
+    </w:p>
+    <w:p>
+      <w:pPr>
+        <w:rPr>
+          <w:rFonts w:hint="eastAsia"/>
+          <w:lang w:val="en-US"/>
+        </w:rPr>
+      </w:pPr>
+      <w:r>
+        <w:rPr>
+          <w:rFonts w:hint="eastAsia"/>
+          <w:lang w:val="en-US"/>
+        </w:rPr>
+        <w:t>Today I studied React fundamentals from the React Docs and React Crash Course. I followed the `REACT-TASK-TRACKER` project to understand how a React application is built with components, state, hooks, events, JSON Server, and routing.</w:t>
+      </w:r>
+    </w:p>
+    <w:p>
+      <w:pPr>
+        <w:rPr>
+          <w:rFonts w:hint="eastAsia"/>
+          <w:lang w:val="en-US"/>
+        </w:rPr>
+      </w:pPr>
+      <w:r>
+        <w:rPr>
+          <w:rFonts w:hint="eastAsia"/>
+          <w:lang w:val="en-US"/>
+        </w:rPr>
+        <w:t>I learned how to split the UI into reusable components, such as `Header`, `Button`, `Tasks`, `Task`, `AddTask`, `Footer`, and `About`. This helped me understand that React applications are built from small components that pass data using props.</w:t>
+      </w:r>
+    </w:p>
+    <w:p>
+      <w:pPr>
+        <w:rPr>
+          <w:rFonts w:hint="eastAsia"/>
+          <w:lang w:val="en-US"/>
+        </w:rPr>
+      </w:pPr>
+      <w:r>
+        <w:rPr>
+          <w:rFonts w:hint="eastAsia"/>
+          <w:lang w:val="en-US"/>
+        </w:rPr>
+        <w:t>I practiced using state and hooks. In `App.js`, I used `useState` to store tasks and control whether the add task form is shown. I also used `useEffect` to load task data when the page first opens. In `AddTask.js`, I learned how form inputs can be controlled with state.</w:t>
+      </w:r>
+    </w:p>
+    <w:p>
+      <w:pPr>
+        <w:rPr>
+          <w:rFonts w:hint="eastAsia"/>
+          <w:lang w:val="en-US"/>
+        </w:rPr>
+      </w:pPr>
+      <w:r>
+        <w:rPr>
+          <w:rFonts w:hint="eastAsia"/>
+          <w:lang w:val="en-US"/>
+        </w:rPr>
+        <w:t>I also learned how events work in React. I practiced clicking the Add button, submitting a form, deleting a task with an icon, and double-clicking a task to toggle its reminder status.</w:t>
+      </w:r>
+    </w:p>
+    <w:p>
+      <w:pPr>
+        <w:rPr>
+          <w:rFonts w:hint="eastAsia"/>
+          <w:lang w:val="en-US"/>
+        </w:rPr>
+      </w:pPr>
+      <w:r>
+        <w:rPr>
+          <w:rFonts w:hint="eastAsia"/>
+          <w:lang w:val="en-US"/>
+        </w:rPr>
+        <w:t>Another important part was using JSON Server. The project used `db.json` as a simple backend, and I practiced fetching tasks, adding new tasks with `POST`, updating reminders with `PUT`, and deleting tasks with `DELETE`.</w:t>
+      </w:r>
+    </w:p>
+    <w:p>
+      <w:pPr>
+        <w:rPr>
+          <w:rFonts w:hint="eastAsia"/>
+          <w:lang w:val="en-US"/>
+        </w:rPr>
+      </w:pPr>
+      <w:r>
+        <w:rPr>
+          <w:rFonts w:hint="eastAsia"/>
+          <w:lang w:val="en-US"/>
+        </w:rPr>
+        <w:t>Finally, I learned basic routing with `react-router-dom`. The app used routes for the main task page and the About page, and the footer link allowed navigation without refreshing the page.</w:t>
+      </w:r>
+    </w:p>
+    <w:p>
+      <w:pPr>
+        <w:rPr>
+          <w:rFonts w:hint="eastAsia"/>
+          <w:lang w:val="en-US"/>
+        </w:rPr>
+      </w:pPr>
+      <w:r>
+        <w:rPr>
+          <w:rFonts w:hint="eastAsia"/>
+          <w:lang w:val="en-US"/>
+        </w:rPr>
+        <w:t>Overall, this module helped me understand the basic structure of React projects. I now feel more comfortable working with components, props, state, hooks, events, simple APIs, and routing.</w:t>
+      </w:r>
+    </w:p>
+    <w:p>
+      <w:pPr>
+        <w:rPr>
+          <w:rFonts w:hint="eastAsia"/>
+          <w:lang w:val="en-US"/>
+        </w:rPr>
+      </w:pPr>
+    </w:p>
+    <w:p>
+      <w:pPr>
+        <w:rPr>
+          <w:rFonts w:hint="eastAsia"/>
+          <w:lang w:val="en-US"/>
+        </w:rPr>
+      </w:pPr>
+    </w:p>
+    <w:p>
+      <w:pPr>
+        <w:rPr>
+          <w:rFonts w:hint="eastAsia"/>
+          <w:lang w:val="en-US"/>
+        </w:rPr>
+      </w:pPr>
+      <w:r>
+        <w:rPr>
+          <w:rFonts w:hint="eastAsia"/>
+          <w:lang w:val="en-US"/>
+        </w:rPr>
+        <w:t>MERN</w:t>
+      </w:r>
+      <w:r>
+        <w:rPr>
+          <w:rFonts w:hint="eastAsia" w:eastAsia="宋体"/>
+          <w:lang w:val="en-US" w:eastAsia="zh-CN"/>
+        </w:rPr>
+        <w:t>-</w:t>
+      </w:r>
+      <w:r>
+        <w:rPr>
+          <w:rFonts w:hint="eastAsia"/>
+          <w:lang w:val="en-US"/>
+        </w:rPr>
+        <w:t>Stack</w:t>
+      </w:r>
+    </w:p>
+    <w:p>
+      <w:pPr>
+        <w:rPr>
+          <w:rFonts w:hint="eastAsia"/>
+          <w:lang w:val="en-US"/>
+        </w:rPr>
+      </w:pPr>
+    </w:p>
+    <w:p>
+      <w:pPr>
+        <w:rPr>
+          <w:rFonts w:hint="eastAsia"/>
+          <w:lang w:val="en-US"/>
+        </w:rPr>
+      </w:pPr>
+      <w:r>
+        <w:rPr>
+          <w:rFonts w:hint="eastAsia"/>
+          <w:lang w:val="en-US"/>
+        </w:rPr>
+        <w:t>Today I studied the MERN Stack example project and followed the MERN-TUTORIAL project. I focused on videos 1-4, which covered how to build a full stack app from scratch using MongoDB, Express, React, and Node.js.</w:t>
+      </w:r>
+    </w:p>
+    <w:p>
+      <w:pPr>
+        <w:rPr>
+          <w:rFonts w:hint="eastAsia"/>
+          <w:lang w:val="en-US"/>
+        </w:rPr>
+      </w:pPr>
+      <w:r>
+        <w:rPr>
+          <w:rFonts w:hint="eastAsia"/>
+          <w:lang w:val="en-US"/>
+        </w:rPr>
+        <w:t>I first learned how the backend is structured. In server.js, I saw how Express is used to create the API server, connect middleware, and register routes. I also learned how the app connects to MongoDB using Mongoose in the database config file.</w:t>
+      </w:r>
+    </w:p>
+    <w:p>
+      <w:pPr>
+        <w:rPr>
+          <w:rFonts w:hint="eastAsia"/>
+          <w:lang w:val="en-US"/>
+        </w:rPr>
+      </w:pPr>
+      <w:r>
+        <w:rPr>
+          <w:rFonts w:hint="eastAsia"/>
+          <w:lang w:val="en-US"/>
+        </w:rPr>
+        <w:t>I practiced creating backend models and controllers. The project has user and goal models, and I learned how schemas define the data structure. I also learned how controllers handle CRUD operations for goals, such as getting, creating, updating, and deleting data.</w:t>
+      </w:r>
+    </w:p>
+    <w:p>
+      <w:pPr>
+        <w:rPr>
+          <w:rFonts w:hint="eastAsia"/>
+          <w:lang w:val="en-US"/>
+        </w:rPr>
+      </w:pPr>
+      <w:r>
+        <w:rPr>
+          <w:rFonts w:hint="eastAsia"/>
+          <w:lang w:val="en-US"/>
+        </w:rPr>
+        <w:t>Another important part was authentication. I learned how users can register and log in, how passwords are hashed with bcrypt, and how JWT tokens are used to protect private routes. The auth middleware checks the token before allowing access to goal routes.</w:t>
+      </w:r>
+    </w:p>
+    <w:p>
+      <w:pPr>
+        <w:rPr>
+          <w:rFonts w:hint="eastAsia"/>
+          <w:lang w:val="en-US"/>
+        </w:rPr>
+      </w:pPr>
+      <w:r>
+        <w:rPr>
+          <w:rFonts w:hint="eastAsia"/>
+          <w:lang w:val="en-US"/>
+        </w:rPr>
+        <w:t>On the frontend, I learned how React is used to build pages such as Login, Register, and Dashboard. I also practiced React Router for navigation between pages. The dashboard loads the user’s goals after login.</w:t>
+      </w:r>
+    </w:p>
+    <w:p>
+      <w:pPr>
+        <w:rPr>
+          <w:rFonts w:hint="eastAsia"/>
+          <w:lang w:val="en-US"/>
+        </w:rPr>
+      </w:pPr>
+      <w:r>
+        <w:rPr>
+          <w:rFonts w:hint="eastAsia"/>
+          <w:lang w:val="en-US"/>
+        </w:rPr>
+        <w:t>I learned how Redux Toolkit manages application state. The project uses slices for authentication and goals, and async thunks are used to call the backend API. This helped me understand how frontend and backend communicate in a MERN app.</w:t>
+      </w:r>
       <w:bookmarkStart w:id="0" w:name="_GoBack"/>
       <w:bookmarkEnd w:id="0"/>
     </w:p>
     <w:p>
       <w:pPr>
         <w:rPr>
-          <w:rFonts w:hint="eastAsia" w:ascii="Times New Roman" w:hAnsi="Times New Roman" w:eastAsia="Times New Roman" w:cs="Times New Roman"/>
-          <w:sz w:val="24"/>
-          <w:szCs w:val="24"/>
-          <w:lang w:val="en-US" w:eastAsia="en-US" w:bidi="ar-SA"/>
-        </w:rPr>
-      </w:pPr>
-      <w:r>
-        <w:rPr>
-          <w:rFonts w:hint="eastAsia" w:ascii="Times New Roman" w:hAnsi="Times New Roman" w:eastAsia="Times New Roman" w:cs="Times New Roman"/>
-          <w:sz w:val="24"/>
-          <w:szCs w:val="24"/>
-          <w:lang w:val="en-US" w:eastAsia="en-US" w:bidi="ar-SA"/>
-        </w:rPr>
-        <w:t>Express JS</w:t>
-      </w:r>
-    </w:p>
-    <w:p>
-      <w:pPr>
-        <w:rPr>
-          <w:rFonts w:hint="eastAsia" w:ascii="Times New Roman" w:hAnsi="Times New Roman" w:eastAsia="Times New Roman" w:cs="Times New Roman"/>
-          <w:sz w:val="24"/>
-          <w:szCs w:val="24"/>
-          <w:lang w:val="en-US" w:eastAsia="en-US" w:bidi="ar-SA"/>
-        </w:rPr>
-      </w:pPr>
-    </w:p>
-    <w:p>
-      <w:pPr>
-        <w:rPr>
-          <w:rFonts w:hint="eastAsia" w:ascii="Times New Roman" w:hAnsi="Times New Roman" w:eastAsia="Times New Roman" w:cs="Times New Roman"/>
-          <w:sz w:val="24"/>
-          <w:szCs w:val="24"/>
-          <w:lang w:val="en-US" w:eastAsia="en-US" w:bidi="ar-SA"/>
-        </w:rPr>
-      </w:pPr>
-      <w:r>
-        <w:rPr>
-          <w:rFonts w:hint="eastAsia" w:ascii="Times New Roman" w:hAnsi="Times New Roman" w:eastAsia="Times New Roman" w:cs="Times New Roman"/>
-          <w:sz w:val="24"/>
-          <w:szCs w:val="24"/>
-          <w:lang w:val="en-US" w:eastAsia="en-US" w:bidi="ar-SA"/>
-        </w:rPr>
-        <w:t>Today I studied the Express JS Crash Course and followed the `EXPRESS-CRASH` and `EXPRESS2` projects. I learned that Express.js is a framework for Node.js that makes it easier to create web servers, routes, APIs, and middleware.</w:t>
-      </w:r>
-    </w:p>
-    <w:p>
-      <w:pPr>
-        <w:rPr>
-          <w:rFonts w:hint="eastAsia" w:ascii="Times New Roman" w:hAnsi="Times New Roman" w:eastAsia="Times New Roman" w:cs="Times New Roman"/>
-          <w:sz w:val="24"/>
-          <w:szCs w:val="24"/>
-          <w:lang w:val="en-US" w:eastAsia="en-US" w:bidi="ar-SA"/>
-        </w:rPr>
-      </w:pPr>
-      <w:r>
-        <w:rPr>
-          <w:rFonts w:hint="eastAsia" w:ascii="Times New Roman" w:hAnsi="Times New Roman" w:eastAsia="Times New Roman" w:cs="Times New Roman"/>
-          <w:sz w:val="24"/>
-          <w:szCs w:val="24"/>
-          <w:lang w:val="en-US" w:eastAsia="en-US" w:bidi="ar-SA"/>
-        </w:rPr>
-        <w:t>In the `EXPRESS-CRASH` project, I learned how to create an Express server with `express()`, set up middleware with `app.use()`, and serve static files from the `public` folder. I also learned how to use `express.json()` and `express.urlencoded()` to read request body data.</w:t>
-      </w:r>
-    </w:p>
-    <w:p>
-      <w:pPr>
-        <w:rPr>
-          <w:rFonts w:hint="eastAsia" w:ascii="Times New Roman" w:hAnsi="Times New Roman" w:eastAsia="Times New Roman" w:cs="Times New Roman"/>
-          <w:sz w:val="24"/>
-          <w:szCs w:val="24"/>
-          <w:lang w:val="en-US" w:eastAsia="en-US" w:bidi="ar-SA"/>
-        </w:rPr>
-      </w:pPr>
-      <w:r>
-        <w:rPr>
-          <w:rFonts w:hint="eastAsia" w:ascii="Times New Roman" w:hAnsi="Times New Roman" w:eastAsia="Times New Roman" w:cs="Times New Roman"/>
-          <w:sz w:val="24"/>
-          <w:szCs w:val="24"/>
-          <w:lang w:val="en-US" w:eastAsia="en-US" w:bidi="ar-SA"/>
-        </w:rPr>
-        <w:t>I practiced routing by creating `/api/posts` routes. I learned how to use `GET`, `POST`, `PUT`, and `DELETE` requests to read, create, update, and delete post data. I also learned how route parameters like `/:id` and query parameters like `?limit=2` work.</w:t>
-      </w:r>
-    </w:p>
-    <w:p>
-      <w:pPr>
-        <w:rPr>
-          <w:rFonts w:hint="eastAsia" w:ascii="Times New Roman" w:hAnsi="Times New Roman" w:eastAsia="Times New Roman" w:cs="Times New Roman"/>
-          <w:sz w:val="24"/>
-          <w:szCs w:val="24"/>
-          <w:lang w:val="en-US" w:eastAsia="en-US" w:bidi="ar-SA"/>
-        </w:rPr>
-      </w:pPr>
-      <w:r>
-        <w:rPr>
-          <w:rFonts w:hint="eastAsia" w:ascii="Times New Roman" w:hAnsi="Times New Roman" w:eastAsia="Times New Roman" w:cs="Times New Roman"/>
-          <w:sz w:val="24"/>
-          <w:szCs w:val="24"/>
-          <w:lang w:val="en-US" w:eastAsia="en-US" w:bidi="ar-SA"/>
-        </w:rPr>
-        <w:t>I also learned how to organize Express code better by separating routes, controllers, and middleware. The controller file handled the main logic, while middleware files handled logging, 404 errors, and general error responses.</w:t>
-      </w:r>
-    </w:p>
-    <w:p>
-      <w:pPr>
-        <w:rPr>
-          <w:rFonts w:hint="eastAsia" w:ascii="Times New Roman" w:hAnsi="Times New Roman" w:eastAsia="Times New Roman" w:cs="Times New Roman"/>
-          <w:sz w:val="24"/>
-          <w:szCs w:val="24"/>
-          <w:lang w:val="en-US" w:eastAsia="en-US" w:bidi="ar-SA"/>
-        </w:rPr>
-      </w:pPr>
-      <w:r>
-        <w:rPr>
-          <w:rFonts w:hint="eastAsia" w:ascii="Times New Roman" w:hAnsi="Times New Roman" w:eastAsia="Times New Roman" w:cs="Times New Roman"/>
-          <w:sz w:val="24"/>
-          <w:szCs w:val="24"/>
-          <w:lang w:val="en-US" w:eastAsia="en-US" w:bidi="ar-SA"/>
-        </w:rPr>
-        <w:t>In the `EXPRESS2` project, I learned the basic use of EJS templates. I practiced setting the view engine, rendering an `index.ejs` page, passing data such as `title`, `message`, and `people`, and including a partial header.</w:t>
-      </w:r>
-    </w:p>
-    <w:p>
-      <w:pPr>
-        <w:rPr>
-          <w:rFonts w:hint="eastAsia" w:ascii="Times New Roman" w:hAnsi="Times New Roman" w:eastAsia="Times New Roman" w:cs="Times New Roman"/>
-          <w:sz w:val="24"/>
-          <w:szCs w:val="24"/>
-          <w:lang w:val="en-US" w:eastAsia="en-US" w:bidi="ar-SA"/>
-        </w:rPr>
-      </w:pPr>
-      <w:r>
-        <w:rPr>
-          <w:rFonts w:hint="eastAsia" w:ascii="Times New Roman" w:hAnsi="Times New Roman" w:eastAsia="Times New Roman" w:cs="Times New Roman"/>
-          <w:sz w:val="24"/>
-          <w:szCs w:val="24"/>
-          <w:lang w:val="en-US" w:eastAsia="en-US" w:bidi="ar-SA"/>
-        </w:rPr>
-        <w:t>Overall, this module helped me understand the basic concepts and usage of Express.js. I now feel more comfortable building simple APIs and web pages with Express.</w:t>
-      </w:r>
-    </w:p>
-    <w:p>
-      <w:pPr>
-        <w:rPr>
-          <w:lang w:val="en-US"/>
-        </w:rPr>
-      </w:pPr>
-    </w:p>
-    <w:p>
-      <w:pPr>
-        <w:rPr>
-          <w:lang w:val="en-US"/>
-        </w:rPr>
-      </w:pPr>
-    </w:p>
-    <w:p>
-      <w:pPr>
-        <w:rPr>
-          <w:rFonts w:hint="default"/>
-          <w:lang w:val="en-US"/>
-        </w:rPr>
-      </w:pPr>
-      <w:r>
-        <w:rPr>
-          <w:rFonts w:hint="default"/>
-          <w:lang w:val="en-US"/>
-        </w:rPr>
-        <w:t>React</w:t>
-      </w:r>
-    </w:p>
-    <w:p>
-      <w:pPr>
-        <w:rPr>
-          <w:rFonts w:hint="default"/>
-          <w:lang w:val="en-US"/>
-        </w:rPr>
-      </w:pPr>
-    </w:p>
-    <w:p>
-      <w:pPr>
-        <w:rPr>
-          <w:rFonts w:hint="eastAsia"/>
-          <w:lang w:val="en-US"/>
-        </w:rPr>
-      </w:pPr>
-      <w:r>
-        <w:rPr>
-          <w:rFonts w:hint="eastAsia"/>
-          <w:lang w:val="en-US"/>
-        </w:rPr>
-        <w:t>Today I studied React fundamentals from the React Docs and React Crash Course. I followed the `REACT-TASK-TRACKER` project to understand how a React application is built with components, state, hooks, events, JSON Server, and routing.</w:t>
-      </w:r>
-    </w:p>
-    <w:p>
-      <w:pPr>
-        <w:rPr>
-          <w:rFonts w:hint="eastAsia"/>
-          <w:lang w:val="en-US"/>
-        </w:rPr>
-      </w:pPr>
-      <w:r>
-        <w:rPr>
-          <w:rFonts w:hint="eastAsia"/>
-          <w:lang w:val="en-US"/>
-        </w:rPr>
-        <w:t>I learned how to split the UI into reusable components, such as `Header`, `Button`, `Tasks`, `Task`, `AddTask`, `Footer`, and `About`. This helped me understand that React applications are built from small components that pass data using props.</w:t>
-      </w:r>
-    </w:p>
-    <w:p>
-      <w:pPr>
-        <w:rPr>
-          <w:rFonts w:hint="eastAsia"/>
-          <w:lang w:val="en-US"/>
-        </w:rPr>
-      </w:pPr>
-      <w:r>
-        <w:rPr>
-          <w:rFonts w:hint="eastAsia"/>
-          <w:lang w:val="en-US"/>
-        </w:rPr>
-        <w:t>I practiced using state and hooks. In `App.js`, I used `useState` to store tasks and control whether the add task form is shown. I also used `useEffect` to load task data when the page first opens. In `AddTask.js`, I learned how form inputs can be controlled with state.</w:t>
-      </w:r>
-    </w:p>
-    <w:p>
-      <w:pPr>
-        <w:rPr>
-          <w:rFonts w:hint="eastAsia"/>
-          <w:lang w:val="en-US"/>
-        </w:rPr>
-      </w:pPr>
-      <w:r>
-        <w:rPr>
-          <w:rFonts w:hint="eastAsia"/>
-          <w:lang w:val="en-US"/>
-        </w:rPr>
-        <w:t>I also learned how events work in React. I practiced clicking the Add button, submitting a form, deleting a task with an icon, and double-clicking a task to toggle its reminder status.</w:t>
-      </w:r>
-    </w:p>
-    <w:p>
-      <w:pPr>
-        <w:rPr>
-          <w:rFonts w:hint="eastAsia"/>
-          <w:lang w:val="en-US"/>
-        </w:rPr>
-      </w:pPr>
-      <w:r>
-        <w:rPr>
-          <w:rFonts w:hint="eastAsia"/>
-          <w:lang w:val="en-US"/>
-        </w:rPr>
-        <w:t>Another important part was using JSON Server. The project used `db.json` as a simple backend, and I practiced fetching tasks, adding new tasks with `POST`, updating reminders with `PUT`, and deleting tasks with `DELETE`.</w:t>
-      </w:r>
-    </w:p>
-    <w:p>
-      <w:pPr>
-        <w:rPr>
-          <w:rFonts w:hint="eastAsia"/>
-          <w:lang w:val="en-US"/>
-        </w:rPr>
-      </w:pPr>
-      <w:r>
-        <w:rPr>
-          <w:rFonts w:hint="eastAsia"/>
-          <w:lang w:val="en-US"/>
-        </w:rPr>
-        <w:t>Finally, I learned basic routing with `react-router-dom`. The app used routes for the main task page and the About page, and the footer link allowed navigation without refreshing the page.</w:t>
-      </w:r>
-    </w:p>
-    <w:p>
-      <w:pPr>
-        <w:rPr>
-          <w:lang w:val="en-US"/>
-        </w:rPr>
-      </w:pPr>
-      <w:r>
-        <w:rPr>
-          <w:rFonts w:hint="eastAsia"/>
-          <w:lang w:val="en-US"/>
-        </w:rPr>
-        <w:t>Overall, this module helped me understand the basic structure of React projects. I now feel more comfortable working with components, props, state, hooks, events, simple APIs, and routing.</w:t>
+          <w:rFonts w:hint="eastAsia"/>
+          <w:lang w:val="en-US"/>
+        </w:rPr>
+      </w:pPr>
+      <w:r>
+        <w:rPr>
+          <w:rFonts w:hint="eastAsia"/>
+          <w:lang w:val="en-US"/>
+        </w:rPr>
+        <w:t>Overall, this module helped me understand how a complete MERN application works. I now have a clearer idea of how MongoDB, Express, React, Node.js, authentication, routing, and Redux fit together in one full stack project.</w:t>
       </w:r>
     </w:p>
     <w:p>
@@ -2507,69 +2666,12 @@
 </file>
 
 <file path=customXml/item1.xml><?xml version="1.0" encoding="utf-8"?>
-<ct:contentTypeSchema xmlns:ct="http://schemas.microsoft.com/office/2006/metadata/contentType" xmlns:ma="http://schemas.microsoft.com/office/2006/metadata/properties/metaAttributes" ma:contentTypeVersion="1" ma:versionID="f4b075d3ca74a5dbaed73e767a156aa0" ma:contentTypeScope="" ma:contentTypeID="0x01010017418C401CCB2042A3A99A19F43F356D" ma:contentTypeName="Asiakirja" ma:contentTypeDescription="Luo uusi asiakirja." ct:_="" ma:_="">
-  <xsd:schema xmlns:p="http://schemas.microsoft.com/office/2006/metadata/properties" xmlns:ns1="http://schemas.microsoft.com/sharepoint/v3" xmlns:xsd="http://www.w3.org/2001/XMLSchema" ma:fieldsID="4340a008e99365d80b71206bae222996" ns1:_="" ma:root="true" targetNamespace="http://schemas.microsoft.com/office/2006/metadata/properties">
-    <xsd:import namespace="http://schemas.microsoft.com/sharepoint/v3"/>
-    <xsd:element name="properties">
-      <xsd:complexType>
-        <xsd:sequence>
-          <xsd:element name="documentManagement">
-            <xsd:complexType>
-              <xsd:all>
-                <xsd:element ref="ns1:PublishingStartDate" minOccurs="0"/>
-                <xsd:element ref="ns1:PublishingExpirationDate" minOccurs="0"/>
-              </xsd:all>
-            </xsd:complexType>
-          </xsd:element>
-        </xsd:sequence>
-      </xsd:complexType>
-    </xsd:element>
-  </xsd:schema>
-  <xsd:schema xmlns:xsd="http://www.w3.org/2001/XMLSchema" xmlns:dms="http://schemas.microsoft.com/office/2006/documentManagement/types" targetNamespace="http://schemas.microsoft.com/sharepoint/v3" elementFormDefault="qualified">
-    <xsd:import namespace="http://schemas.microsoft.com/office/2006/documentManagement/types"/>
-    <xsd:element ma:index="8" ma:internalName="PublishingStartDate" ma:hidden="true" name="PublishingStartDate" ma:displayName="Ajoituksen alkamispäivämäärä" ma:description="" nillable="true">
-      <xsd:simpleType>
-        <xsd:restriction base="dms:Unknown"/>
-      </xsd:simpleType>
-    </xsd:element>
-    <xsd:element ma:index="9" ma:internalName="PublishingExpirationDate" ma:hidden="true" name="PublishingExpirationDate" ma:displayName="Ajoituksen päättymispäivämäärä" ma:description="" nillable="true">
-      <xsd:simpleType>
-        <xsd:restriction base="dms:Unknown"/>
-      </xsd:simpleType>
-    </xsd:element>
-  </xsd:schema>
-  <xsd:schema xmlns:dc="http://purl.org/dc/elements/1.1/" xmlns:dcterms="http://purl.org/dc/terms/" xmlns:xsd="http://www.w3.org/2001/XMLSchema" xmlns="http://schemas.openxmlformats.org/package/2006/metadata/core-properties" xmlns:odoc="http://schemas.microsoft.com/office/internal/2005/internalDocumentation" xmlns:xsi="http://www.w3.org/2001/XMLSchema-instance" targetNamespace="http://schemas.openxmlformats.org/package/2006/metadata/core-properties" attributeFormDefault="unqualified" elementFormDefault="qualified" blockDefault="#all">
-    <xsd:import schemaLocation="http://dublincore.org/schemas/xmls/qdc/2003/04/02/dc.xsd" namespace="http://purl.org/dc/elements/1.1/"/>
-    <xsd:import schemaLocation="http://dublincore.org/schemas/xmls/qdc/2003/04/02/dcterms.xsd" namespace="http://purl.org/dc/terms/"/>
-    <xsd:element type="CT_coreProperties" name="coreProperties"/>
-    <xsd:complexType name="CT_coreProperties">
-      <xsd:all>
-        <xsd:element ref="dc:creator" maxOccurs="1" minOccurs="0"/>
-        <xsd:element ref="dcterms:created" maxOccurs="1" minOccurs="0"/>
-        <xsd:element ref="dc:identifier" maxOccurs="1" minOccurs="0"/>
-        <xsd:element ma:index="0" ma:readOnly="true" type="xsd:string" name="contentType" maxOccurs="1" minOccurs="0" ma:displayName="Sisältölaji"/>
-        <xsd:element ma:index="4" ref="dc:title" maxOccurs="1" minOccurs="0" ma:displayName="Otsikko"/>
-        <xsd:element ref="dc:subject" maxOccurs="1" minOccurs="0"/>
-        <xsd:element ref="dc:description" maxOccurs="1" minOccurs="0"/>
-        <xsd:element type="xsd:string" name="keywords" maxOccurs="1" minOccurs="0"/>
-        <xsd:element ref="dc:language" maxOccurs="1" minOccurs="0"/>
-        <xsd:element type="xsd:string" name="category" maxOccurs="1" minOccurs="0"/>
-        <xsd:element type="xsd:string" name="version" maxOccurs="1" minOccurs="0"/>
-        <xsd:element type="xsd:string" name="revision" maxOccurs="1" minOccurs="0">
-          <xsd:annotation>
-            <xsd:documentation>
-                        This value indicates the number of saves or revisions. The application is responsible for updating this value after each revision.
-                    </xsd:documentation>
-          </xsd:annotation>
-        </xsd:element>
-        <xsd:element type="xsd:string" name="lastModifiedBy" maxOccurs="1" minOccurs="0"/>
-        <xsd:element ref="dcterms:modified" maxOccurs="1" minOccurs="0"/>
-        <xsd:element type="xsd:dateTime" name="lastPrinted" maxOccurs="1" minOccurs="0"/>
-        <xsd:element type="xsd:string" name="contentStatus" maxOccurs="1" minOccurs="0"/>
-      </xsd:all>
-    </xsd:complexType>
-  </xsd:schema>
-</ct:contentTypeSchema>
+<p:properties xmlns:pc="http://schemas.microsoft.com/office/infopath/2007/PartnerControls" xmlns:xsi="http://www.w3.org/2001/XMLSchema-instance" xmlns:p="http://schemas.microsoft.com/office/2006/metadata/properties">
+  <documentManagement>
+    <PublishingExpirationDate xmlns="http://schemas.microsoft.com/sharepoint/v3" xsi:nil="true"/>
+    <PublishingStartDate xmlns="http://schemas.microsoft.com/sharepoint/v3" xsi:nil="true"/>
+  </documentManagement>
+</p:properties>
 </file>
 
 <file path=customXml/item2.xml><?xml version="1.0" encoding="utf-8"?>
@@ -2582,16 +2684,73 @@
 </file>
 
 <file path=customXml/item3.xml><?xml version="1.0" encoding="utf-8"?>
-<p:properties xmlns:pc="http://schemas.microsoft.com/office/infopath/2007/PartnerControls" xmlns:p="http://schemas.microsoft.com/office/2006/metadata/properties" xmlns:xsi="http://www.w3.org/2001/XMLSchema-instance">
-  <documentManagement>
-    <PublishingExpirationDate xmlns="http://schemas.microsoft.com/sharepoint/v3" xsi:nil="true"/>
-    <PublishingStartDate xmlns="http://schemas.microsoft.com/sharepoint/v3" xsi:nil="true"/>
-  </documentManagement>
-</p:properties>
+<ct:contentTypeSchema xmlns:ct="http://schemas.microsoft.com/office/2006/metadata/contentType" xmlns:ma="http://schemas.microsoft.com/office/2006/metadata/properties/metaAttributes" ma:versionID="f4b075d3ca74a5dbaed73e767a156aa0" ma:contentTypeID="0x01010017418C401CCB2042A3A99A19F43F356D" ma:contentTypeName="Asiakirja" ma:contentTypeDescription="Luo uusi asiakirja." ct:_="" ma:contentTypeVersion="1" ma:_="" ma:contentTypeScope="">
+  <xsd:schema xmlns:xsd="http://www.w3.org/2001/XMLSchema" xmlns:p="http://schemas.microsoft.com/office/2006/metadata/properties" xmlns:ns1="http://schemas.microsoft.com/sharepoint/v3" targetNamespace="http://schemas.microsoft.com/office/2006/metadata/properties" ns1:_="" ma:fieldsID="4340a008e99365d80b71206bae222996" ma:root="true">
+    <xsd:import namespace="http://schemas.microsoft.com/sharepoint/v3"/>
+    <xsd:element name="properties">
+      <xsd:complexType>
+        <xsd:sequence>
+          <xsd:element name="documentManagement">
+            <xsd:complexType>
+              <xsd:all>
+                <xsd:element minOccurs="0" ref="ns1:PublishingStartDate"/>
+                <xsd:element minOccurs="0" ref="ns1:PublishingExpirationDate"/>
+              </xsd:all>
+            </xsd:complexType>
+          </xsd:element>
+        </xsd:sequence>
+      </xsd:complexType>
+    </xsd:element>
+  </xsd:schema>
+  <xsd:schema xmlns:xsd="http://www.w3.org/2001/XMLSchema" xmlns:dms="http://schemas.microsoft.com/office/2006/documentManagement/types" targetNamespace="http://schemas.microsoft.com/sharepoint/v3" elementFormDefault="qualified">
+    <xsd:import namespace="http://schemas.microsoft.com/office/2006/documentManagement/types"/>
+    <xsd:element ma:internalName="PublishingStartDate" nillable="true" ma:index="8" ma:displayName="Ajoituksen alkamispäivämäärä" name="PublishingStartDate" ma:description="" ma:hidden="true">
+      <xsd:simpleType>
+        <xsd:restriction base="dms:Unknown"/>
+      </xsd:simpleType>
+    </xsd:element>
+    <xsd:element ma:internalName="PublishingExpirationDate" nillable="true" ma:index="9" ma:displayName="Ajoituksen päättymispäivämäärä" name="PublishingExpirationDate" ma:description="" ma:hidden="true">
+      <xsd:simpleType>
+        <xsd:restriction base="dms:Unknown"/>
+      </xsd:simpleType>
+    </xsd:element>
+  </xsd:schema>
+  <xsd:schema xmlns:xsd="http://www.w3.org/2001/XMLSchema" xmlns="http://schemas.openxmlformats.org/package/2006/metadata/core-properties" xmlns:xsi="http://www.w3.org/2001/XMLSchema-instance" xmlns:dc="http://purl.org/dc/elements/1.1/" xmlns:dcterms="http://purl.org/dc/terms/" xmlns:odoc="http://schemas.microsoft.com/office/internal/2005/internalDocumentation" blockDefault="#all" targetNamespace="http://schemas.openxmlformats.org/package/2006/metadata/core-properties" elementFormDefault="qualified" attributeFormDefault="unqualified">
+    <xsd:import namespace="http://purl.org/dc/elements/1.1/" schemaLocation="http://dublincore.org/schemas/xmls/qdc/2003/04/02/dc.xsd"/>
+    <xsd:import namespace="http://purl.org/dc/terms/" schemaLocation="http://dublincore.org/schemas/xmls/qdc/2003/04/02/dcterms.xsd"/>
+    <xsd:element type="CT_coreProperties" name="coreProperties"/>
+    <xsd:complexType name="CT_coreProperties">
+      <xsd:all>
+        <xsd:element maxOccurs="1" minOccurs="0" ref="dc:creator"/>
+        <xsd:element maxOccurs="1" minOccurs="0" ref="dcterms:created"/>
+        <xsd:element maxOccurs="1" minOccurs="0" ref="dc:identifier"/>
+        <xsd:element maxOccurs="1" type="xsd:string" minOccurs="0" ma:index="0" ma:displayName="Sisältölaji" name="contentType" ma:readOnly="true"/>
+        <xsd:element maxOccurs="1" minOccurs="0" ma:index="4" ref="dc:title" ma:displayName="Otsikko"/>
+        <xsd:element maxOccurs="1" minOccurs="0" ref="dc:subject"/>
+        <xsd:element maxOccurs="1" minOccurs="0" ref="dc:description"/>
+        <xsd:element maxOccurs="1" type="xsd:string" minOccurs="0" name="keywords"/>
+        <xsd:element maxOccurs="1" minOccurs="0" ref="dc:language"/>
+        <xsd:element maxOccurs="1" type="xsd:string" minOccurs="0" name="category"/>
+        <xsd:element maxOccurs="1" type="xsd:string" minOccurs="0" name="version"/>
+        <xsd:element maxOccurs="1" type="xsd:string" minOccurs="0" name="revision">
+          <xsd:annotation>
+            <xsd:documentation>
+                        This value indicates the number of saves or revisions. The application is responsible for updating this value after each revision.
+                    </xsd:documentation>
+          </xsd:annotation>
+        </xsd:element>
+        <xsd:element maxOccurs="1" type="xsd:string" minOccurs="0" name="lastModifiedBy"/>
+        <xsd:element maxOccurs="1" minOccurs="0" ref="dcterms:modified"/>
+        <xsd:element maxOccurs="1" type="xsd:dateTime" minOccurs="0" name="lastPrinted"/>
+        <xsd:element maxOccurs="1" type="xsd:string" minOccurs="0" name="contentStatus"/>
+      </xsd:all>
+    </xsd:complexType>
+  </xsd:schema>
+</ct:contentTypeSchema>
 </file>
 
 <file path=customXml/itemProps1.xml><?xml version="1.0" encoding="utf-8"?>
-<ds:datastoreItem xmlns:ds="http://schemas.openxmlformats.org/officeDocument/2006/customXml" ds:itemID="{B9A87442-5A7B-46FD-BD28-170CE9B7256F}">
+<ds:datastoreItem xmlns:ds="http://schemas.openxmlformats.org/officeDocument/2006/customXml" ds:itemID="{FA8F0064-303C-446D-896E-46EEB9A79DC3}">
   <ds:schemaRefs/>
 </ds:datastoreItem>
 </file>
@@ -2603,7 +2762,7 @@
 </file>
 
 <file path=customXml/itemProps3.xml><?xml version="1.0" encoding="utf-8"?>
-<ds:datastoreItem xmlns:ds="http://schemas.openxmlformats.org/officeDocument/2006/customXml" ds:itemID="{FA8F0064-303C-446D-896E-46EEB9A79DC3}">
+<ds:datastoreItem xmlns:ds="http://schemas.openxmlformats.org/officeDocument/2006/customXml" ds:itemID="{B9A87442-5A7B-46FD-BD28-170CE9B7256F}">
   <ds:schemaRefs/>
 </ds:datastoreItem>
 </file>
</xml_diff>